<commit_message>
atualização de guia tecnico
</commit_message>
<xml_diff>
--- a/docs/Guia Prático de Infraestrutura Linux com Debian e OpenWRT.docx
+++ b/docs/Guia Prático de Infraestrutura Linux com Debian e OpenWRT.docx
@@ -7644,7 +7644,21 @@
         <w:rPr>
           <w:lang w:val="pt-BR"/>
         </w:rPr>
-        <w:t xml:space="preserve"> diretamente como superusuário (R</w:t>
+        <w:t xml:space="preserve"> diretamente como </w:t>
+      </w:r>
+      <w:proofErr w:type="spellStart"/>
+      <w:r>
+        <w:rPr>
+          <w:lang w:val="pt-BR"/>
+        </w:rPr>
+        <w:t>superusuário</w:t>
+      </w:r>
+      <w:proofErr w:type="spellEnd"/>
+      <w:r>
+        <w:rPr>
+          <w:lang w:val="pt-BR"/>
+        </w:rPr>
+        <w:t xml:space="preserve"> (R</w:t>
       </w:r>
       <w:r>
         <w:rPr>
@@ -8390,10 +8404,7 @@
         <w:jc w:val="both"/>
       </w:pPr>
       <w:r>
-        <w:t>Apt update</w:t>
-      </w:r>
-      <w:r>
-        <w:t xml:space="preserve"> </w:t>
+        <w:t xml:space="preserve">Apt update </w:t>
       </w:r>
       <w:r>
         <w:t>→</w:t>
@@ -9071,6 +9082,482 @@
       </w:r>
       <w:bookmarkEnd w:id="28"/>
     </w:p>
+    <w:p/>
+    <w:p>
+      <w:pPr>
+        <w:jc w:val="both"/>
+      </w:pPr>
+      <w:r>
+        <w:t>Durante a implementação e documentação do projeto, foram desenvolvidos diversos conhecimentos técnicos e operacionais, além de uma visão mais ampla de infraestrutura. Esses aprendizados serão fundamentais em minha jornada para não apenas me tornar um desenvolvedor, mas um criador e mantenedor de sistemas.</w:t>
+      </w:r>
+    </w:p>
+    <w:p>
+      <w:pPr>
+        <w:jc w:val="both"/>
+      </w:pPr>
+    </w:p>
+    <w:p>
+      <w:pPr>
+        <w:ind w:firstLine="720"/>
+        <w:rPr>
+          <w:b/>
+          <w:bCs/>
+          <w:color w:val="000000" w:themeColor="text1"/>
+        </w:rPr>
+      </w:pPr>
+      <w:r>
+        <w:rPr>
+          <w:b/>
+          <w:bCs/>
+          <w:color w:val="000000" w:themeColor="text1"/>
+        </w:rPr>
+        <w:t>6.1.</w:t>
+      </w:r>
+      <w:r>
+        <w:rPr>
+          <w:b/>
+          <w:bCs/>
+          <w:color w:val="000000" w:themeColor="text1"/>
+        </w:rPr>
+        <w:t>1</w:t>
+      </w:r>
+      <w:r>
+        <w:rPr>
+          <w:b/>
+          <w:bCs/>
+          <w:color w:val="000000" w:themeColor="text1"/>
+        </w:rPr>
+        <w:t>.</w:t>
+      </w:r>
+      <w:r>
+        <w:rPr>
+          <w:color w:val="000000" w:themeColor="text1"/>
+        </w:rPr>
+        <w:t xml:space="preserve"> </w:t>
+      </w:r>
+      <w:r>
+        <w:rPr>
+          <w:b/>
+          <w:bCs/>
+          <w:color w:val="000000" w:themeColor="text1"/>
+        </w:rPr>
+        <w:t>Aprendizado tecnico</w:t>
+      </w:r>
+    </w:p>
+    <w:p/>
+    <w:p>
+      <w:pPr>
+        <w:rPr>
+          <w:b/>
+          <w:bCs/>
+        </w:rPr>
+      </w:pPr>
+      <w:r>
+        <w:rPr>
+          <w:b/>
+          <w:bCs/>
+        </w:rPr>
+        <w:t>Funcionamento de pacotes APT e seu gerenciamento</w:t>
+      </w:r>
+      <w:r>
+        <w:rPr>
+          <w:b/>
+          <w:bCs/>
+        </w:rPr>
+        <w:t>.</w:t>
+      </w:r>
+    </w:p>
+    <w:p/>
+    <w:p>
+      <w:pPr>
+        <w:jc w:val="both"/>
+      </w:pPr>
+      <w:r>
+        <w:t>Aprendi como o APT realmente funciona como sistema de gerenciamento de pacotes. Compreendi a diferença entre seus comandos de forma clara, através de testes, e como cada um impacta o sistema de maneira específica. Também enfrentei problemas com travas de pacotes e dependências quebradas, o que me forçou a entender o funcionamento interno desse gerenciador, ao invés de apenas repetir comandos prontos. Esses procedimentos me deram mais segurança para administrar atualizações e instalações de forma responsável, principalmente em um ambiente de servidor.</w:t>
+      </w:r>
+    </w:p>
+    <w:p>
+      <w:pPr>
+        <w:rPr>
+          <w:b/>
+          <w:bCs/>
+        </w:rPr>
+      </w:pPr>
+    </w:p>
+    <w:p>
+      <w:pPr>
+        <w:rPr>
+          <w:b/>
+          <w:bCs/>
+        </w:rPr>
+      </w:pPr>
+      <w:r>
+        <w:rPr>
+          <w:b/>
+          <w:bCs/>
+        </w:rPr>
+        <w:t>Sistemas de permissões Linux</w:t>
+      </w:r>
+      <w:r>
+        <w:rPr>
+          <w:b/>
+          <w:bCs/>
+        </w:rPr>
+        <w:t>.</w:t>
+      </w:r>
+    </w:p>
+    <w:p>
+      <w:pPr>
+        <w:rPr>
+          <w:b/>
+          <w:bCs/>
+        </w:rPr>
+      </w:pPr>
+    </w:p>
+    <w:p>
+      <w:pPr>
+        <w:jc w:val="both"/>
+      </w:pPr>
+      <w:r>
+        <w:t>Entendi como o sistema de permissões do Linux é estruturado em usuários, grupos e níveis de acesso. Compreendi a importância do acesso de “superusuário” (root) e por que seu uso deve ser restrito e estritamente bem definido nos parâmetros de segurança. Percebi que uma configuração inadequada pode comprometer completamente a integridade do sistema. Todo esse processo me fez enxergar que segurança não é algo opcional em um servidor bem estruturado, mas sim parte essencial de sua configuração básica.</w:t>
+      </w:r>
+    </w:p>
+    <w:p>
+      <w:pPr>
+        <w:jc w:val="both"/>
+        <w:rPr>
+          <w:b/>
+          <w:bCs/>
+        </w:rPr>
+      </w:pPr>
+    </w:p>
+    <w:p>
+      <w:pPr>
+        <w:rPr>
+          <w:b/>
+          <w:bCs/>
+        </w:rPr>
+      </w:pPr>
+      <w:r>
+        <w:rPr>
+          <w:b/>
+          <w:bCs/>
+        </w:rPr>
+        <w:t>Diagnostico de erros</w:t>
+      </w:r>
+    </w:p>
+    <w:p>
+      <w:pPr>
+        <w:rPr>
+          <w:b/>
+          <w:bCs/>
+        </w:rPr>
+      </w:pPr>
+    </w:p>
+    <w:p>
+      <w:pPr>
+        <w:jc w:val="both"/>
+      </w:pPr>
+      <w:r>
+        <w:t>Durante o projeto, desenvolvi a habilidade de interpretar mensagens de erro ao invés de simplesmente ignorá-las. Aprendi a entender as saídas dos comandos e a buscar a causa raiz dos problemas. No decorrer dessa jornada, percebi que muitos erros são autoexplicativos quando analisados com paciência e atenção. Esse aprendizado foi um dos mais importantes, pois me ensinou a ser mais cauteloso diante de falhas, algo essencial para alguém que deseja viver e realmente entender o que é desenvolvimento.</w:t>
+      </w:r>
+    </w:p>
+    <w:p>
+      <w:pPr>
+        <w:jc w:val="both"/>
+        <w:rPr>
+          <w:b/>
+          <w:bCs/>
+        </w:rPr>
+      </w:pPr>
+    </w:p>
+    <w:p>
+      <w:pPr>
+        <w:rPr>
+          <w:b/>
+          <w:bCs/>
+        </w:rPr>
+      </w:pPr>
+      <w:r>
+        <w:rPr>
+          <w:b/>
+          <w:bCs/>
+        </w:rPr>
+        <w:t>Conceitos de servidor como serviço continuo</w:t>
+      </w:r>
+    </w:p>
+    <w:p>
+      <w:pPr>
+        <w:rPr>
+          <w:b/>
+          <w:bCs/>
+        </w:rPr>
+      </w:pPr>
+    </w:p>
+    <w:p>
+      <w:pPr>
+        <w:jc w:val="both"/>
+      </w:pPr>
+      <w:r>
+        <w:t>Tive grande satisfação em entender com clareza que um servidor não é apenas uma máquina ligada, mas sim um ambiente que precisa operar de forma contínua, estável e previsível. Um servidor precisa garantir disponibilidade contínua dentro do possível, mantendo seus serviços ativos, monitorando os processos e evitando que qualquer alteração comprometa seu funcionamento. Esse entendimento mudou minha visão sobre responsabilidade técnica e me fez compreender que um servidor exige planejamento, organização e disciplina.</w:t>
+      </w:r>
+    </w:p>
+    <w:p>
+      <w:pPr>
+        <w:jc w:val="both"/>
+      </w:pPr>
+    </w:p>
+    <w:p>
+      <w:pPr>
+        <w:rPr>
+          <w:b/>
+          <w:bCs/>
+          <w:color w:val="000000" w:themeColor="text1"/>
+        </w:rPr>
+      </w:pPr>
+      <w:r>
+        <w:rPr>
+          <w:b/>
+          <w:bCs/>
+          <w:color w:val="000000" w:themeColor="text1"/>
+        </w:rPr>
+        <w:br w:type="page"/>
+      </w:r>
+    </w:p>
+    <w:p>
+      <w:pPr>
+        <w:ind w:firstLine="720"/>
+        <w:rPr>
+          <w:b/>
+          <w:bCs/>
+          <w:color w:val="000000" w:themeColor="text1"/>
+        </w:rPr>
+      </w:pPr>
+      <w:r>
+        <w:rPr>
+          <w:b/>
+          <w:bCs/>
+          <w:color w:val="000000" w:themeColor="text1"/>
+        </w:rPr>
+        <w:lastRenderedPageBreak/>
+        <w:t xml:space="preserve">6.1.2. </w:t>
+      </w:r>
+      <w:r>
+        <w:rPr>
+          <w:b/>
+          <w:bCs/>
+          <w:color w:val="000000" w:themeColor="text1"/>
+        </w:rPr>
+        <w:t>Aprendizado Operacional</w:t>
+      </w:r>
+    </w:p>
+    <w:p>
+      <w:pPr>
+        <w:rPr>
+          <w:b/>
+          <w:bCs/>
+          <w:lang w:val="pt-BR"/>
+        </w:rPr>
+      </w:pPr>
+    </w:p>
+    <w:p>
+      <w:pPr>
+        <w:rPr>
+          <w:lang w:val="pt-BR"/>
+        </w:rPr>
+      </w:pPr>
+      <w:r>
+        <w:rPr>
+          <w:lang w:val="pt-BR"/>
+        </w:rPr>
+        <w:t>Importância da documentação</w:t>
+      </w:r>
+    </w:p>
+    <w:p>
+      <w:pPr>
+        <w:rPr>
+          <w:lang w:val="pt-BR"/>
+        </w:rPr>
+      </w:pPr>
+    </w:p>
+    <w:p>
+      <w:pPr>
+        <w:rPr>
+          <w:lang w:val="pt-BR"/>
+        </w:rPr>
+      </w:pPr>
+      <w:r>
+        <w:rPr>
+          <w:lang w:val="pt-BR"/>
+        </w:rPr>
+        <w:t>Organização de conhecimento</w:t>
+      </w:r>
+    </w:p>
+    <w:p>
+      <w:pPr>
+        <w:rPr>
+          <w:lang w:val="pt-BR"/>
+        </w:rPr>
+      </w:pPr>
+    </w:p>
+    <w:p>
+      <w:pPr>
+        <w:rPr>
+          <w:lang w:val="pt-BR"/>
+        </w:rPr>
+      </w:pPr>
+      <w:r>
+        <w:rPr>
+          <w:lang w:val="pt-BR"/>
+        </w:rPr>
+        <w:t>Transformar erro em documentação pois erros são aprendizado</w:t>
+      </w:r>
+    </w:p>
+    <w:p>
+      <w:pPr>
+        <w:rPr>
+          <w:lang w:val="pt-BR"/>
+        </w:rPr>
+      </w:pPr>
+    </w:p>
+    <w:p>
+      <w:pPr>
+        <w:rPr>
+          <w:lang w:val="pt-BR"/>
+        </w:rPr>
+      </w:pPr>
+      <w:r>
+        <w:rPr>
+          <w:lang w:val="pt-BR"/>
+        </w:rPr>
+        <w:t>Resolução sistemática de problemas</w:t>
+      </w:r>
+    </w:p>
+    <w:p>
+      <w:pPr>
+        <w:rPr>
+          <w:lang w:val="pt-BR"/>
+        </w:rPr>
+      </w:pPr>
+    </w:p>
+    <w:p>
+      <w:pPr>
+        <w:rPr>
+          <w:b/>
+          <w:bCs/>
+          <w:color w:val="FF0000"/>
+          <w:lang w:val="pt-BR"/>
+        </w:rPr>
+      </w:pPr>
+      <w:r>
+        <w:rPr>
+          <w:b/>
+          <w:bCs/>
+          <w:color w:val="FF0000"/>
+        </w:rPr>
+        <w:t>Aprendizado de Mentalidade</w:t>
+      </w:r>
+    </w:p>
+    <w:p/>
+    <w:p>
+      <w:pPr>
+        <w:rPr>
+          <w:lang w:val="pt-BR"/>
+        </w:rPr>
+      </w:pPr>
+      <w:r>
+        <w:rPr>
+          <w:lang w:val="pt-BR"/>
+        </w:rPr>
+        <w:t>Autonomia técnica</w:t>
+      </w:r>
+    </w:p>
+    <w:p>
+      <w:pPr>
+        <w:rPr>
+          <w:lang w:val="pt-BR"/>
+        </w:rPr>
+      </w:pPr>
+    </w:p>
+    <w:p>
+      <w:pPr>
+        <w:rPr>
+          <w:lang w:val="pt-BR"/>
+        </w:rPr>
+      </w:pPr>
+      <w:r>
+        <w:rPr>
+          <w:lang w:val="pt-BR"/>
+        </w:rPr>
+        <w:t>Organização de conhecimento</w:t>
+      </w:r>
+    </w:p>
+    <w:p>
+      <w:pPr>
+        <w:rPr>
+          <w:lang w:val="pt-BR"/>
+        </w:rPr>
+      </w:pPr>
+    </w:p>
+    <w:p>
+      <w:pPr>
+        <w:rPr>
+          <w:lang w:val="pt-BR"/>
+        </w:rPr>
+      </w:pPr>
+      <w:r>
+        <w:rPr>
+          <w:lang w:val="pt-BR"/>
+        </w:rPr>
+        <w:t>Transformar erro em documentação</w:t>
+      </w:r>
+    </w:p>
+    <w:p>
+      <w:pPr>
+        <w:rPr>
+          <w:lang w:val="pt-BR"/>
+        </w:rPr>
+      </w:pPr>
+    </w:p>
+    <w:p>
+      <w:pPr>
+        <w:rPr>
+          <w:lang w:val="pt-BR"/>
+        </w:rPr>
+      </w:pPr>
+      <w:r>
+        <w:rPr>
+          <w:lang w:val="pt-BR"/>
+        </w:rPr>
+        <w:t xml:space="preserve">Pensar como </w:t>
+      </w:r>
+      <w:proofErr w:type="spellStart"/>
+      <w:r>
+        <w:rPr>
+          <w:lang w:val="pt-BR"/>
+        </w:rPr>
+        <w:t>DevOps</w:t>
+      </w:r>
+      <w:proofErr w:type="spellEnd"/>
+      <w:r>
+        <w:rPr>
+          <w:lang w:val="pt-BR"/>
+        </w:rPr>
+        <w:t xml:space="preserve"> iniciante</w:t>
+      </w:r>
+    </w:p>
+    <w:p/>
+    <w:p/>
+    <w:p/>
+    <w:p/>
+    <w:p>
+      <w:r>
+        <w:t>Este projeto representou mais do que a configuração de um sistema Debian; representou a consolidação de uma base sólida em administração de servidores Linux e o início de uma postura profissional voltada à responsabilidade, organização e continuidade de serviço.</w:t>
+      </w:r>
+    </w:p>
+    <w:p/>
+    <w:p/>
+    <w:p/>
     <w:p>
       <w:pPr>
         <w:pStyle w:val="Ttulo1"/>

</xml_diff>

<commit_message>
Atualização de arquivo pdf, sobre openwrt
</commit_message>
<xml_diff>
--- a/docs/Guia Prático de Infraestrutura Linux com Debian e OpenWRT.docx
+++ b/docs/Guia Prático de Infraestrutura Linux com Debian e OpenWRT.docx
@@ -3068,7 +3068,7 @@
                 <w:noProof/>
                 <w:webHidden/>
               </w:rPr>
-              <w:t>12</w:t>
+              <w:t>15</w:t>
             </w:r>
             <w:r>
               <w:rPr>
@@ -3162,7 +3162,7 @@
                 <w:noProof/>
                 <w:webHidden/>
               </w:rPr>
-              <w:t>12</w:t>
+              <w:t>15</w:t>
             </w:r>
             <w:r>
               <w:rPr>
@@ -3256,7 +3256,7 @@
                 <w:noProof/>
                 <w:webHidden/>
               </w:rPr>
-              <w:t>12</w:t>
+              <w:t>15</w:t>
             </w:r>
             <w:r>
               <w:rPr>
@@ -3350,7 +3350,7 @@
                 <w:noProof/>
                 <w:webHidden/>
               </w:rPr>
-              <w:t>12</w:t>
+              <w:t>15</w:t>
             </w:r>
             <w:r>
               <w:rPr>
@@ -3444,7 +3444,7 @@
                 <w:noProof/>
                 <w:webHidden/>
               </w:rPr>
-              <w:t>12</w:t>
+              <w:t>15</w:t>
             </w:r>
             <w:r>
               <w:rPr>
@@ -3538,7 +3538,7 @@
                 <w:noProof/>
                 <w:webHidden/>
               </w:rPr>
-              <w:t>12</w:t>
+              <w:t>15</w:t>
             </w:r>
             <w:r>
               <w:rPr>
@@ -3632,7 +3632,7 @@
                 <w:noProof/>
                 <w:webHidden/>
               </w:rPr>
-              <w:t>12</w:t>
+              <w:t>15</w:t>
             </w:r>
             <w:r>
               <w:rPr>
@@ -3726,7 +3726,7 @@
                 <w:noProof/>
                 <w:webHidden/>
               </w:rPr>
-              <w:t>12</w:t>
+              <w:t>15</w:t>
             </w:r>
             <w:r>
               <w:rPr>
@@ -3820,7 +3820,7 @@
                 <w:noProof/>
                 <w:webHidden/>
               </w:rPr>
-              <w:t>12</w:t>
+              <w:t>16</w:t>
             </w:r>
             <w:r>
               <w:rPr>
@@ -3914,7 +3914,7 @@
                 <w:noProof/>
                 <w:webHidden/>
               </w:rPr>
-              <w:t>12</w:t>
+              <w:t>16</w:t>
             </w:r>
             <w:r>
               <w:rPr>
@@ -3995,20 +3995,17 @@
                 <w:noProof/>
                 <w:webHidden/>
               </w:rPr>
-            </w:r>
-            <w:r>
-              <w:rPr>
-                <w:noProof/>
-                <w:webHidden/>
-              </w:rPr>
               <w:fldChar w:fldCharType="separate"/>
             </w:r>
             <w:r>
               <w:rPr>
-                <w:noProof/>
-                <w:webHidden/>
-              </w:rPr>
-              <w:t>13</w:t>
+                <w:b/>
+                <w:bCs/>
+                <w:noProof/>
+                <w:webHidden/>
+                <w:lang w:val="pt-BR"/>
+              </w:rPr>
+              <w:t>Erro! Indicador não definido.</w:t>
             </w:r>
             <w:r>
               <w:rPr>
@@ -4089,20 +4086,17 @@
                 <w:noProof/>
                 <w:webHidden/>
               </w:rPr>
-            </w:r>
-            <w:r>
-              <w:rPr>
-                <w:noProof/>
-                <w:webHidden/>
-              </w:rPr>
               <w:fldChar w:fldCharType="separate"/>
             </w:r>
             <w:r>
               <w:rPr>
-                <w:noProof/>
-                <w:webHidden/>
-              </w:rPr>
-              <w:t>13</w:t>
+                <w:b/>
+                <w:bCs/>
+                <w:noProof/>
+                <w:webHidden/>
+                <w:lang w:val="pt-BR"/>
+              </w:rPr>
+              <w:t>Erro! Indicador não definido.</w:t>
             </w:r>
             <w:r>
               <w:rPr>
@@ -4183,20 +4177,17 @@
                 <w:noProof/>
                 <w:webHidden/>
               </w:rPr>
-            </w:r>
-            <w:r>
-              <w:rPr>
-                <w:noProof/>
-                <w:webHidden/>
-              </w:rPr>
               <w:fldChar w:fldCharType="separate"/>
             </w:r>
             <w:r>
               <w:rPr>
-                <w:noProof/>
-                <w:webHidden/>
-              </w:rPr>
-              <w:t>13</w:t>
+                <w:b/>
+                <w:bCs/>
+                <w:noProof/>
+                <w:webHidden/>
+                <w:lang w:val="pt-BR"/>
+              </w:rPr>
+              <w:t>Erro! Indicador não definido.</w:t>
             </w:r>
             <w:r>
               <w:rPr>
@@ -4290,7 +4281,7 @@
                 <w:noProof/>
                 <w:webHidden/>
               </w:rPr>
-              <w:t>14</w:t>
+              <w:t>17</w:t>
             </w:r>
             <w:r>
               <w:rPr>
@@ -4384,7 +4375,7 @@
                 <w:noProof/>
                 <w:webHidden/>
               </w:rPr>
-              <w:t>15</w:t>
+              <w:t>18</w:t>
             </w:r>
             <w:r>
               <w:rPr>
@@ -4478,7 +4469,7 @@
                 <w:noProof/>
                 <w:webHidden/>
               </w:rPr>
-              <w:t>15</w:t>
+              <w:t>18</w:t>
             </w:r>
             <w:r>
               <w:rPr>
@@ -4572,7 +4563,7 @@
                 <w:noProof/>
                 <w:webHidden/>
               </w:rPr>
-              <w:t>18</w:t>
+              <w:t>21</w:t>
             </w:r>
             <w:r>
               <w:rPr>
@@ -8829,6 +8820,1106 @@
     <w:p/>
     <w:p>
       <w:pPr>
+        <w:pStyle w:val="PargrafodaLista"/>
+        <w:numPr>
+          <w:ilvl w:val="0"/>
+          <w:numId w:val="18"/>
+        </w:numPr>
+        <w:rPr>
+          <w:b/>
+          <w:bCs/>
+        </w:rPr>
+      </w:pPr>
+      <w:bookmarkStart w:id="14" w:name="_Toc223105318"/>
+      <w:r>
+        <w:rPr>
+          <w:b/>
+          <w:bCs/>
+        </w:rPr>
+        <w:lastRenderedPageBreak/>
+        <w:t>Roteador WR740N com OpenWRT</w:t>
+      </w:r>
+    </w:p>
+    <w:p>
+      <w:pPr>
+        <w:pStyle w:val="PargrafodaLista"/>
+        <w:ind w:left="360"/>
+        <w:rPr>
+          <w:b/>
+          <w:bCs/>
+        </w:rPr>
+      </w:pPr>
+    </w:p>
+    <w:p>
+      <w:pPr>
+        <w:jc w:val="both"/>
+        <w:rPr>
+          <w:lang w:val="pt-BR"/>
+        </w:rPr>
+      </w:pPr>
+      <w:proofErr w:type="spellStart"/>
+      <w:r>
+        <w:rPr>
+          <w:lang w:val="pt-BR"/>
+        </w:rPr>
+        <w:t>OpenWRT</w:t>
+      </w:r>
+      <w:proofErr w:type="spellEnd"/>
+      <w:r>
+        <w:rPr>
+          <w:lang w:val="pt-BR"/>
+        </w:rPr>
+        <w:t xml:space="preserve"> é um firmware de código aberto baseado em Linux, desenvolvido</w:t>
+      </w:r>
+      <w:r>
+        <w:rPr>
+          <w:lang w:val="pt-BR"/>
+        </w:rPr>
+        <w:t xml:space="preserve"> </w:t>
+      </w:r>
+      <w:r>
+        <w:rPr>
+          <w:lang w:val="pt-BR"/>
+        </w:rPr>
+        <w:t>especificamente para</w:t>
+      </w:r>
+      <w:r>
+        <w:rPr>
+          <w:lang w:val="pt-BR"/>
+        </w:rPr>
+        <w:t xml:space="preserve"> </w:t>
+      </w:r>
+      <w:r>
+        <w:rPr>
+          <w:lang w:val="pt-BR"/>
+        </w:rPr>
+        <w:t>roteadores e dispositivos embarcados.</w:t>
+      </w:r>
+    </w:p>
+    <w:p>
+      <w:pPr>
+        <w:jc w:val="both"/>
+        <w:rPr>
+          <w:lang w:val="pt-BR"/>
+        </w:rPr>
+      </w:pPr>
+      <w:r>
+        <w:rPr>
+          <w:lang w:val="pt-BR"/>
+        </w:rPr>
+        <w:br/>
+        <w:t xml:space="preserve">Assim como o Windows é um sistema operacional para computadores e o Android para celulares, o </w:t>
+      </w:r>
+      <w:proofErr w:type="spellStart"/>
+      <w:r>
+        <w:rPr>
+          <w:lang w:val="pt-BR"/>
+        </w:rPr>
+        <w:t>OpenWRT</w:t>
+      </w:r>
+      <w:proofErr w:type="spellEnd"/>
+      <w:r>
+        <w:rPr>
+          <w:lang w:val="pt-BR"/>
+        </w:rPr>
+        <w:t xml:space="preserve"> funciona como um sistema operacional completo para roteadores.</w:t>
+      </w:r>
+    </w:p>
+    <w:p>
+      <w:pPr>
+        <w:jc w:val="both"/>
+        <w:rPr>
+          <w:lang w:val="pt-BR"/>
+        </w:rPr>
+      </w:pPr>
+      <w:r>
+        <w:rPr>
+          <w:lang w:val="pt-BR"/>
+        </w:rPr>
+        <w:t>Ele substitui o firmware original do fabricante por um sistema livre, programável e altamente configurável, permitindo controle total da rede.</w:t>
+      </w:r>
+    </w:p>
+    <w:p/>
+    <w:p>
+      <w:pPr>
+        <w:pStyle w:val="PargrafodaLista"/>
+        <w:numPr>
+          <w:ilvl w:val="1"/>
+          <w:numId w:val="46"/>
+        </w:numPr>
+        <w:rPr>
+          <w:b/>
+          <w:bCs/>
+        </w:rPr>
+      </w:pPr>
+      <w:r>
+        <w:rPr>
+          <w:b/>
+          <w:bCs/>
+        </w:rPr>
+        <w:t>O que é Firmware?</w:t>
+      </w:r>
+    </w:p>
+    <w:p/>
+    <w:p>
+      <w:pPr>
+        <w:jc w:val="both"/>
+        <w:rPr>
+          <w:lang w:val="pt-BR"/>
+        </w:rPr>
+      </w:pPr>
+      <w:r>
+        <w:rPr>
+          <w:lang w:val="pt-BR"/>
+        </w:rPr>
+        <w:t>Firmware é o software responsável por controlar diretamente o hardware de um dispositivo eletrônico.</w:t>
+      </w:r>
+    </w:p>
+    <w:p>
+      <w:pPr>
+        <w:jc w:val="both"/>
+        <w:rPr>
+          <w:lang w:val="pt-BR"/>
+        </w:rPr>
+      </w:pPr>
+      <w:r>
+        <w:rPr>
+          <w:lang w:val="pt-BR"/>
+        </w:rPr>
+        <w:br/>
+        <w:t>Roteadores vendidos de fábrica possuem firmware proprietário, geralmente limitado e com poucas opções avançadas.</w:t>
+      </w:r>
+    </w:p>
+    <w:p>
+      <w:pPr>
+        <w:jc w:val="both"/>
+        <w:rPr>
+          <w:lang w:val="pt-BR"/>
+        </w:rPr>
+      </w:pPr>
+    </w:p>
+    <w:p>
+      <w:pPr>
+        <w:jc w:val="both"/>
+        <w:rPr>
+          <w:lang w:val="pt-BR"/>
+        </w:rPr>
+      </w:pPr>
+      <w:r>
+        <w:rPr>
+          <w:lang w:val="pt-BR"/>
+        </w:rPr>
+        <w:t xml:space="preserve">O </w:t>
+      </w:r>
+      <w:proofErr w:type="spellStart"/>
+      <w:r>
+        <w:rPr>
+          <w:lang w:val="pt-BR"/>
+        </w:rPr>
+        <w:t>OpenWRT</w:t>
+      </w:r>
+      <w:proofErr w:type="spellEnd"/>
+      <w:r>
+        <w:rPr>
+          <w:lang w:val="pt-BR"/>
+        </w:rPr>
+        <w:t xml:space="preserve"> substitui esse firmware por uma alternativa aberta, permitindo instalar pacotes, configurar serviços e transformar o roteador em um pequeno servidor Linux.</w:t>
+      </w:r>
+    </w:p>
+    <w:p/>
+    <w:p>
+      <w:pPr>
+        <w:rPr>
+          <w:b/>
+          <w:bCs/>
+        </w:rPr>
+      </w:pPr>
+      <w:r>
+        <w:rPr>
+          <w:b/>
+          <w:bCs/>
+        </w:rPr>
+        <w:t>Riscos e cuidados importantes</w:t>
+      </w:r>
+    </w:p>
+    <w:p>
+      <w:pPr>
+        <w:rPr>
+          <w:b/>
+          <w:bCs/>
+        </w:rPr>
+      </w:pPr>
+    </w:p>
+    <w:p>
+      <w:r>
+        <w:t>A instalação do OpenWRT não é nenhum bixo de ste cabeças, porem é valido se atentar a alguns cuidados importantes antes e durante a instalação deste sistema para garantir a estabilidade e seu bom funcionamento.</w:t>
+      </w:r>
+    </w:p>
+    <w:p>
+      <w:pPr>
+        <w:rPr>
+          <w:b/>
+          <w:bCs/>
+        </w:rPr>
+      </w:pPr>
+    </w:p>
+    <w:p>
+      <w:pPr>
+        <w:rPr>
+          <w:b/>
+          <w:bCs/>
+        </w:rPr>
+      </w:pPr>
+      <w:r>
+        <w:rPr>
+          <w:b/>
+          <w:bCs/>
+        </w:rPr>
+        <w:t>Risco de bricker o roteador</w:t>
+      </w:r>
+    </w:p>
+    <w:p/>
+    <w:p>
+      <w:r>
+        <w:t>O termo brick que em ingles siguinifica “tijolo”, é utilizado quando algum dispositivo eletronoco deixa de funcionar corretamente ou totalmente durante uma falha de firmware</w:t>
+      </w:r>
+      <w:r>
+        <w:t xml:space="preserve"> o tornando praticamente inutilizavel.</w:t>
+      </w:r>
+    </w:p>
+    <w:p/>
+    <w:p>
+      <w:r>
+        <w:t>Soft Brick é um dos dois principais tipos desse efeito, que é quando o roteador ainda liga porem não abre mais o painel web, não distribui internet, não responde corretamente á rede. Normalmente neste caso ainda é possivel recuperar o equipamento com moddo recovery ou apenas reinstalação do firmware.</w:t>
+      </w:r>
+    </w:p>
+    <w:p/>
+    <w:p>
+      <w:r>
+        <w:t>Hard Brick ocorre quando o sistema é comrrompido completamente ou o roteador não liga ou não responde. Neste tipo de situação as vezes pode ser necessario abrir o Hardware, usar cabo serial ou regravar memoria flask manuamente. Para alguns iniciante isto significa diretamente a perda definitivava de seu quipamento</w:t>
+      </w:r>
+    </w:p>
+    <w:p/>
+    <w:p>
+      <w:pPr>
+        <w:rPr>
+          <w:b/>
+          <w:bCs/>
+        </w:rPr>
+      </w:pPr>
+      <w:r>
+        <w:rPr>
+          <w:b/>
+          <w:bCs/>
+        </w:rPr>
+        <w:t>Perda de garantia</w:t>
+      </w:r>
+    </w:p>
+    <w:p>
+      <w:pPr>
+        <w:rPr>
+          <w:b/>
+          <w:bCs/>
+        </w:rPr>
+      </w:pPr>
+    </w:p>
+    <w:p>
+      <w:r>
+        <w:t>Ao instalar o OpenWRT, o firmware original do fabricante é substituido por um sistema alternativo, oque na maioria das vezes anula completamente a garantia do produtoe seu suporte tecnico deixa de ser valido. Por este motivo é recomendado que se utilize equipamentos fora da garantia ou destinados apenas para estudos e testes</w:t>
+      </w:r>
+    </w:p>
+    <w:p>
+      <w:pPr>
+        <w:rPr>
+          <w:b/>
+          <w:bCs/>
+        </w:rPr>
+      </w:pPr>
+    </w:p>
+    <w:p>
+      <w:pPr>
+        <w:rPr>
+          <w:b/>
+          <w:bCs/>
+        </w:rPr>
+      </w:pPr>
+      <w:r>
+        <w:rPr>
+          <w:b/>
+          <w:bCs/>
+        </w:rPr>
+        <w:t>Versão de hardware compativel</w:t>
+      </w:r>
+    </w:p>
+    <w:p>
+      <w:pPr>
+        <w:rPr>
+          <w:b/>
+          <w:bCs/>
+        </w:rPr>
+      </w:pPr>
+    </w:p>
+    <w:p>
+      <w:r>
+        <w:t xml:space="preserve">Um dos erros mais comuns para iniciantes ou intusiaatas comuns é ignorar que o mesmoequipamento pode possuir varias versoes internas disponiveis, embora as vezes o equipamento tenha o mesmo nome comercial o hardware interno pode mudar coisas como: </w:t>
+      </w:r>
+      <w:r>
+        <w:lastRenderedPageBreak/>
+        <w:t>memoria RAM, tamanho de memoria flash, chipset e procesador.</w:t>
+      </w:r>
+    </w:p>
+    <w:p/>
+    <w:p>
+      <w:r>
+        <w:t>Cada versão exige um firmware especifico, e podemos identificar a versão de nosso equipamento apenas verificando a etiqueta na parte inferior do equipamento</w:t>
+      </w:r>
+      <w:r>
+        <w:t>. Apos a confirmação da versão correta de firmware equivalente a o hardware podemos instalar sem problemas e evitar um dos princiapis causadores de “Brick”.</w:t>
+      </w:r>
+    </w:p>
+    <w:p>
+      <w:pPr>
+        <w:rPr>
+          <w:b/>
+          <w:bCs/>
+        </w:rPr>
+      </w:pPr>
+    </w:p>
+    <w:p>
+      <w:pPr>
+        <w:rPr>
+          <w:b/>
+          <w:bCs/>
+        </w:rPr>
+      </w:pPr>
+      <w:r>
+        <w:rPr>
+          <w:b/>
+          <w:bCs/>
+        </w:rPr>
+        <w:t>Queda de energia durante flash</w:t>
+      </w:r>
+    </w:p>
+    <w:p>
+      <w:pPr>
+        <w:rPr>
+          <w:b/>
+          <w:bCs/>
+        </w:rPr>
+      </w:pPr>
+    </w:p>
+    <w:p>
+      <w:r>
+        <w:t>Durante o processo de instalação sera gravador o novo sistema na memoria interna do roteador sobrescrevendo o firmware e suas configurações antigas setor por setor. Se ocorrer queda de energia seja de desligamento acidental ou reinicio forçado o sistema pode ficar incompleto e o roteador não ira conseguir ser inicializado. Algumas recomendações importes saõ a de nunca instalar durantes instabilidade eletricas como durante tempestades, e evitar extenções frouxas ou tomadas ruins.</w:t>
+      </w:r>
+    </w:p>
+    <w:p>
+      <w:r>
+        <w:t>Mesmo que durante a instalação pareeça travado aguarde pelo menos de 5 a 10 minutos para que seja feito o reinicio forçado de seu equipamento, evitando problemas futuros.</w:t>
+      </w:r>
+    </w:p>
+    <w:p>
+      <w:pPr>
+        <w:rPr>
+          <w:b/>
+          <w:bCs/>
+        </w:rPr>
+      </w:pPr>
+    </w:p>
+    <w:p>
+      <w:r>
+        <w:t>Durante a instalação tenha a garantia de energia estavel, e não fechar o navegador durante o processo, Nao desligar o roteador e nem atualizar a pagina, Não remova os cabso e não tente reiniciar manualmente</w:t>
+      </w:r>
+    </w:p>
+    <w:p/>
+    <w:p>
+      <w:r>
+        <w:t>Embora como dito antes, o processo de instalação do OpenWRT seja relativamente algo simples, é necessario a atenção e compreensão basica do procedimento, seguindo de forma cautelosa os cuidados descritos, os riscos de fal</w:t>
+      </w:r>
+      <w:r>
+        <w:t>has é minimo e ao fim do procedimento o usuario passa a ter controle total sobre o equipamento o tranformanto em uma poerosa ferramenta de aprendizado e gerenciamento de redes.</w:t>
+      </w:r>
+    </w:p>
+    <w:p/>
+    <w:p>
+      <w:pPr>
+        <w:pStyle w:val="PargrafodaLista"/>
+        <w:numPr>
+          <w:ilvl w:val="1"/>
+          <w:numId w:val="46"/>
+        </w:numPr>
+        <w:rPr>
+          <w:b/>
+          <w:bCs/>
+        </w:rPr>
+      </w:pPr>
+      <w:r>
+        <w:rPr>
+          <w:b/>
+          <w:bCs/>
+        </w:rPr>
+        <w:t>O que é possivel fazer com OpenWRT.</w:t>
+      </w:r>
+    </w:p>
+    <w:p>
+      <w:pPr>
+        <w:pStyle w:val="PargrafodaLista"/>
+        <w:numPr>
+          <w:ilvl w:val="2"/>
+          <w:numId w:val="46"/>
+        </w:numPr>
+        <w:rPr>
+          <w:b/>
+          <w:bCs/>
+        </w:rPr>
+      </w:pPr>
+      <w:r>
+        <w:rPr>
+          <w:b/>
+          <w:bCs/>
+        </w:rPr>
+        <w:t>Servidor DHCP personalizado</w:t>
+      </w:r>
+    </w:p>
+    <w:p>
+      <w:pPr>
+        <w:pStyle w:val="PargrafodaLista"/>
+        <w:numPr>
+          <w:ilvl w:val="2"/>
+          <w:numId w:val="46"/>
+        </w:numPr>
+        <w:rPr>
+          <w:b/>
+          <w:bCs/>
+        </w:rPr>
+      </w:pPr>
+      <w:r>
+        <w:rPr>
+          <w:b/>
+          <w:bCs/>
+        </w:rPr>
+        <w:t>Firewall avançadi</w:t>
+      </w:r>
+    </w:p>
+    <w:p>
+      <w:pPr>
+        <w:pStyle w:val="PargrafodaLista"/>
+        <w:numPr>
+          <w:ilvl w:val="2"/>
+          <w:numId w:val="46"/>
+        </w:numPr>
+        <w:rPr>
+          <w:b/>
+          <w:bCs/>
+        </w:rPr>
+      </w:pPr>
+      <w:r>
+        <w:rPr>
+          <w:b/>
+          <w:bCs/>
+        </w:rPr>
+        <w:t>VPN(wireguard/ openvpn)</w:t>
+      </w:r>
+    </w:p>
+    <w:p>
+      <w:pPr>
+        <w:pStyle w:val="PargrafodaLista"/>
+        <w:numPr>
+          <w:ilvl w:val="2"/>
+          <w:numId w:val="46"/>
+        </w:numPr>
+        <w:rPr>
+          <w:b/>
+          <w:bCs/>
+        </w:rPr>
+      </w:pPr>
+      <w:r>
+        <w:rPr>
+          <w:b/>
+          <w:bCs/>
+        </w:rPr>
+        <w:t>Servidor DNS LOCAL</w:t>
+      </w:r>
+    </w:p>
+    <w:p>
+      <w:pPr>
+        <w:pStyle w:val="PargrafodaLista"/>
+        <w:numPr>
+          <w:ilvl w:val="2"/>
+          <w:numId w:val="46"/>
+        </w:numPr>
+        <w:rPr>
+          <w:b/>
+          <w:bCs/>
+        </w:rPr>
+      </w:pPr>
+      <w:r>
+        <w:rPr>
+          <w:b/>
+          <w:bCs/>
+        </w:rPr>
+        <w:t>Bloqueio de anuncios</w:t>
+      </w:r>
+    </w:p>
+    <w:p>
+      <w:pPr>
+        <w:pStyle w:val="PargrafodaLista"/>
+        <w:numPr>
+          <w:ilvl w:val="2"/>
+          <w:numId w:val="46"/>
+        </w:numPr>
+        <w:rPr>
+          <w:b/>
+          <w:bCs/>
+        </w:rPr>
+      </w:pPr>
+      <w:r>
+        <w:rPr>
+          <w:b/>
+          <w:bCs/>
+        </w:rPr>
+        <w:t>VLANs</w:t>
+      </w:r>
+    </w:p>
+    <w:p>
+      <w:pPr>
+        <w:pStyle w:val="PargrafodaLista"/>
+        <w:numPr>
+          <w:ilvl w:val="2"/>
+          <w:numId w:val="46"/>
+        </w:numPr>
+        <w:rPr>
+          <w:b/>
+          <w:bCs/>
+        </w:rPr>
+      </w:pPr>
+      <w:r>
+        <w:rPr>
+          <w:b/>
+          <w:bCs/>
+        </w:rPr>
+        <w:t>Servidor SSH</w:t>
+      </w:r>
+    </w:p>
+    <w:p>
+      <w:pPr>
+        <w:rPr>
+          <w:b/>
+          <w:bCs/>
+        </w:rPr>
+      </w:pPr>
+    </w:p>
+    <w:p>
+      <w:pPr>
+        <w:pStyle w:val="PargrafodaLista"/>
+        <w:numPr>
+          <w:ilvl w:val="1"/>
+          <w:numId w:val="46"/>
+        </w:numPr>
+        <w:rPr>
+          <w:b/>
+          <w:bCs/>
+        </w:rPr>
+      </w:pPr>
+      <w:r>
+        <w:rPr>
+          <w:b/>
+          <w:bCs/>
+        </w:rPr>
+        <w:t>Conceitos Fundamentais d</w:t>
+      </w:r>
+      <w:r>
+        <w:rPr>
+          <w:b/>
+          <w:bCs/>
+        </w:rPr>
+        <w:t>e redes e</w:t>
+      </w:r>
+      <w:r>
+        <w:rPr>
+          <w:b/>
+          <w:bCs/>
+        </w:rPr>
+        <w:t xml:space="preserve"> OpenWRT</w:t>
+      </w:r>
+    </w:p>
+    <w:p>
+      <w:pPr>
+        <w:pStyle w:val="PargrafodaLista"/>
+        <w:numPr>
+          <w:ilvl w:val="2"/>
+          <w:numId w:val="46"/>
+        </w:numPr>
+        <w:rPr>
+          <w:b/>
+          <w:bCs/>
+        </w:rPr>
+      </w:pPr>
+      <w:r>
+        <w:rPr>
+          <w:b/>
+          <w:bCs/>
+        </w:rPr>
+        <w:t>Sistema Operacional Embarcado (Embedded Linux)</w:t>
+      </w:r>
+    </w:p>
+    <w:p>
+      <w:pPr>
+        <w:pStyle w:val="PargrafodaLista"/>
+        <w:numPr>
+          <w:ilvl w:val="2"/>
+          <w:numId w:val="46"/>
+        </w:numPr>
+        <w:rPr>
+          <w:b/>
+          <w:bCs/>
+        </w:rPr>
+      </w:pPr>
+      <w:r>
+        <w:rPr>
+          <w:b/>
+          <w:bCs/>
+        </w:rPr>
+        <w:t>Sistema de Arquivos (Filesystem Overlay)</w:t>
+      </w:r>
+    </w:p>
+    <w:p>
+      <w:pPr>
+        <w:pStyle w:val="PargrafodaLista"/>
+        <w:numPr>
+          <w:ilvl w:val="2"/>
+          <w:numId w:val="46"/>
+        </w:numPr>
+        <w:rPr>
+          <w:b/>
+          <w:bCs/>
+        </w:rPr>
+      </w:pPr>
+      <w:r>
+        <w:rPr>
+          <w:b/>
+          <w:bCs/>
+        </w:rPr>
+        <w:t>Gerenciador de pacotes (op</w:t>
+      </w:r>
+      <w:r>
+        <w:rPr>
+          <w:b/>
+          <w:bCs/>
+        </w:rPr>
+        <w:t>k</w:t>
+      </w:r>
+      <w:r>
+        <w:rPr>
+          <w:b/>
+          <w:bCs/>
+        </w:rPr>
+        <w:t>g)</w:t>
+      </w:r>
+    </w:p>
+    <w:p>
+      <w:pPr>
+        <w:pStyle w:val="PargrafodaLista"/>
+        <w:numPr>
+          <w:ilvl w:val="2"/>
+          <w:numId w:val="46"/>
+        </w:numPr>
+        <w:rPr>
+          <w:b/>
+          <w:bCs/>
+        </w:rPr>
+      </w:pPr>
+      <w:r>
+        <w:rPr>
+          <w:b/>
+          <w:bCs/>
+        </w:rPr>
+        <w:t>Unified Configuration Interface</w:t>
+      </w:r>
+    </w:p>
+    <w:p>
+      <w:pPr>
+        <w:pStyle w:val="PargrafodaLista"/>
+        <w:numPr>
+          <w:ilvl w:val="2"/>
+          <w:numId w:val="46"/>
+        </w:numPr>
+        <w:rPr>
+          <w:b/>
+          <w:bCs/>
+        </w:rPr>
+      </w:pPr>
+      <w:r>
+        <w:rPr>
+          <w:b/>
+          <w:bCs/>
+        </w:rPr>
+        <w:t>Acesso via SSH (Administração Real)</w:t>
+      </w:r>
+    </w:p>
+    <w:p>
+      <w:pPr>
+        <w:pStyle w:val="PargrafodaLista"/>
+        <w:numPr>
+          <w:ilvl w:val="2"/>
+          <w:numId w:val="46"/>
+        </w:numPr>
+        <w:rPr>
+          <w:b/>
+          <w:bCs/>
+        </w:rPr>
+      </w:pPr>
+      <w:r>
+        <w:rPr>
+          <w:b/>
+          <w:bCs/>
+        </w:rPr>
+        <w:t>Imagens Firmware (Factory vs Sysupgrade)</w:t>
+      </w:r>
+    </w:p>
+    <w:p>
+      <w:pPr>
+        <w:pStyle w:val="PargrafodaLista"/>
+        <w:numPr>
+          <w:ilvl w:val="2"/>
+          <w:numId w:val="46"/>
+        </w:numPr>
+        <w:rPr>
+          <w:b/>
+          <w:bCs/>
+        </w:rPr>
+      </w:pPr>
+      <w:r>
+        <w:rPr>
+          <w:b/>
+          <w:bCs/>
+        </w:rPr>
+        <w:t>Reset e Recovery</w:t>
+      </w:r>
+    </w:p>
+    <w:p>
+      <w:pPr>
+        <w:pStyle w:val="PargrafodaLista"/>
+        <w:numPr>
+          <w:ilvl w:val="2"/>
+          <w:numId w:val="46"/>
+        </w:numPr>
+        <w:rPr>
+          <w:b/>
+          <w:bCs/>
+        </w:rPr>
+      </w:pPr>
+      <w:r>
+        <w:rPr>
+          <w:b/>
+          <w:bCs/>
+        </w:rPr>
+        <w:t>Filosofia do OpenWRT</w:t>
+      </w:r>
+    </w:p>
+    <w:p>
+      <w:pPr>
+        <w:pStyle w:val="PargrafodaLista"/>
+        <w:ind w:left="1080"/>
+        <w:rPr>
+          <w:b/>
+          <w:bCs/>
+        </w:rPr>
+      </w:pPr>
+    </w:p>
+    <w:p>
+      <w:pPr>
+        <w:pStyle w:val="PargrafodaLista"/>
+        <w:numPr>
+          <w:ilvl w:val="1"/>
+          <w:numId w:val="46"/>
+        </w:numPr>
+        <w:rPr>
+          <w:b/>
+          <w:bCs/>
+        </w:rPr>
+      </w:pPr>
+      <w:r>
+        <w:rPr>
+          <w:b/>
+          <w:bCs/>
+        </w:rPr>
+        <w:t>Guia básico de instalação</w:t>
+      </w:r>
+    </w:p>
+    <w:p>
+      <w:pPr>
+        <w:pStyle w:val="PargrafodaLista"/>
+        <w:numPr>
+          <w:ilvl w:val="1"/>
+          <w:numId w:val="46"/>
+        </w:numPr>
+        <w:rPr>
+          <w:b/>
+          <w:bCs/>
+        </w:rPr>
+      </w:pPr>
+      <w:r>
+        <w:rPr>
+          <w:b/>
+          <w:bCs/>
+        </w:rPr>
+        <w:t>Configurações iniciais recomendas</w:t>
+      </w:r>
+    </w:p>
+    <w:p>
+      <w:pPr>
+        <w:pStyle w:val="PargrafodaLista"/>
+        <w:numPr>
+          <w:ilvl w:val="1"/>
+          <w:numId w:val="46"/>
+        </w:numPr>
+        <w:rPr>
+          <w:b/>
+          <w:bCs/>
+        </w:rPr>
+      </w:pPr>
+      <w:r>
+        <w:rPr>
+          <w:b/>
+          <w:bCs/>
+        </w:rPr>
+        <w:t>O que aprendi usando OpenWRT neste projeto</w:t>
+      </w:r>
+    </w:p>
+    <w:p>
+      <w:pPr>
+        <w:rPr>
+          <w:b/>
+          <w:bCs/>
+        </w:rPr>
+      </w:pPr>
+    </w:p>
+    <w:p>
+      <w:pPr>
+        <w:rPr>
+          <w:b/>
+          <w:bCs/>
+        </w:rPr>
+      </w:pPr>
+    </w:p>
+    <w:p>
+      <w:pPr>
+        <w:rPr>
+          <w:b/>
+          <w:bCs/>
+        </w:rPr>
+      </w:pPr>
+    </w:p>
+    <w:p>
+      <w:pPr>
+        <w:rPr>
+          <w:b/>
+          <w:bCs/>
+        </w:rPr>
+      </w:pPr>
+    </w:p>
+    <w:p>
+      <w:pPr>
+        <w:rPr>
+          <w:b/>
+          <w:bCs/>
+        </w:rPr>
+      </w:pPr>
+    </w:p>
+    <w:p>
+      <w:pPr>
+        <w:rPr>
+          <w:b/>
+          <w:bCs/>
+        </w:rPr>
+      </w:pPr>
+    </w:p>
+    <w:p>
+      <w:pPr>
+        <w:rPr>
+          <w:b/>
+          <w:bCs/>
+        </w:rPr>
+      </w:pPr>
+    </w:p>
+    <w:p>
+      <w:pPr>
+        <w:rPr>
+          <w:b/>
+          <w:bCs/>
+        </w:rPr>
+      </w:pPr>
+    </w:p>
+    <w:p>
+      <w:pPr>
+        <w:rPr>
+          <w:b/>
+          <w:bCs/>
+        </w:rPr>
+      </w:pPr>
+    </w:p>
+    <w:p>
+      <w:pPr>
+        <w:rPr>
+          <w:b/>
+          <w:bCs/>
+        </w:rPr>
+      </w:pPr>
+    </w:p>
+    <w:p>
+      <w:pPr>
+        <w:rPr>
+          <w:b/>
+          <w:bCs/>
+        </w:rPr>
+      </w:pPr>
+    </w:p>
+    <w:p>
+      <w:pPr>
+        <w:rPr>
+          <w:b/>
+          <w:bCs/>
+        </w:rPr>
+      </w:pPr>
+    </w:p>
+    <w:p>
+      <w:pPr>
+        <w:rPr>
+          <w:b/>
+          <w:bCs/>
+        </w:rPr>
+      </w:pPr>
+    </w:p>
+    <w:p>
+      <w:pPr>
+        <w:rPr>
+          <w:b/>
+          <w:bCs/>
+        </w:rPr>
+      </w:pPr>
+    </w:p>
+    <w:p>
+      <w:pPr>
+        <w:rPr>
+          <w:b/>
+          <w:bCs/>
+        </w:rPr>
+      </w:pPr>
+    </w:p>
+    <w:p>
+      <w:pPr>
+        <w:rPr>
+          <w:b/>
+          <w:bCs/>
+        </w:rPr>
+      </w:pPr>
+    </w:p>
+    <w:p>
+      <w:pPr>
+        <w:rPr>
+          <w:b/>
+          <w:bCs/>
+        </w:rPr>
+      </w:pPr>
+    </w:p>
+    <w:p>
+      <w:pPr>
+        <w:rPr>
+          <w:b/>
+          <w:bCs/>
+        </w:rPr>
+      </w:pPr>
+    </w:p>
+    <w:p>
+      <w:pPr>
+        <w:rPr>
+          <w:b/>
+          <w:bCs/>
+        </w:rPr>
+      </w:pPr>
+    </w:p>
+    <w:p>
+      <w:pPr>
+        <w:rPr>
+          <w:b/>
+          <w:bCs/>
+        </w:rPr>
+      </w:pPr>
+    </w:p>
+    <w:p>
+      <w:pPr>
+        <w:rPr>
+          <w:b/>
+          <w:bCs/>
+        </w:rPr>
+      </w:pPr>
+    </w:p>
+    <w:p>
+      <w:pPr>
+        <w:rPr>
+          <w:b/>
+          <w:bCs/>
+        </w:rPr>
+      </w:pPr>
+    </w:p>
+    <w:p>
+      <w:pPr>
+        <w:rPr>
+          <w:b/>
+          <w:bCs/>
+        </w:rPr>
+      </w:pPr>
+    </w:p>
+    <w:p>
+      <w:pPr>
+        <w:rPr>
+          <w:b/>
+          <w:bCs/>
+        </w:rPr>
+      </w:pPr>
+    </w:p>
+    <w:p>
+      <w:pPr>
+        <w:rPr>
+          <w:b/>
+          <w:bCs/>
+        </w:rPr>
+      </w:pPr>
+    </w:p>
+    <w:p>
+      <w:pPr>
+        <w:rPr>
+          <w:b/>
+          <w:bCs/>
+        </w:rPr>
+      </w:pPr>
+    </w:p>
+    <w:p>
+      <w:pPr>
+        <w:rPr>
+          <w:b/>
+          <w:bCs/>
+        </w:rPr>
+      </w:pPr>
+    </w:p>
+    <w:p>
+      <w:pPr>
+        <w:rPr>
+          <w:b/>
+          <w:bCs/>
+        </w:rPr>
+      </w:pPr>
+      <w:r>
+        <w:rPr>
+          <w:b/>
+          <w:bCs/>
+        </w:rPr>
+        <w:br w:type="page"/>
+      </w:r>
+    </w:p>
+    <w:p>
+      <w:pPr>
         <w:pStyle w:val="Ttulo1"/>
         <w:numPr>
           <w:ilvl w:val="0"/>
@@ -8836,7 +9927,6 @@
         </w:numPr>
         <w:spacing w:before="81"/>
       </w:pPr>
-      <w:bookmarkStart w:id="14" w:name="_Toc223105318"/>
       <w:r>
         <w:lastRenderedPageBreak/>
         <w:t>Configuração de Rede</w:t>
@@ -8915,7 +10005,595 @@
       </w:r>
       <w:bookmarkEnd w:id="17"/>
     </w:p>
+    <w:p>
+      <w:pPr>
+        <w:pStyle w:val="Ttulo1"/>
+        <w:numPr>
+          <w:ilvl w:val="2"/>
+          <w:numId w:val="18"/>
+        </w:numPr>
+        <w:spacing w:before="81"/>
+        <w:rPr>
+          <w:b w:val="0"/>
+          <w:bCs w:val="0"/>
+        </w:rPr>
+      </w:pPr>
+      <w:bookmarkStart w:id="18" w:name="_Toc223105322"/>
+      <w:r>
+        <w:rPr>
+          <w:b w:val="0"/>
+          <w:bCs w:val="0"/>
+        </w:rPr>
+        <w:t>Endurecimento Inicial de Segurança</w:t>
+      </w:r>
+      <w:bookmarkEnd w:id="18"/>
+    </w:p>
+    <w:p>
+      <w:pPr>
+        <w:pStyle w:val="Ttulo1"/>
+        <w:numPr>
+          <w:ilvl w:val="2"/>
+          <w:numId w:val="18"/>
+        </w:numPr>
+        <w:spacing w:before="81"/>
+        <w:rPr>
+          <w:b w:val="0"/>
+          <w:bCs w:val="0"/>
+        </w:rPr>
+      </w:pPr>
+      <w:bookmarkStart w:id="19" w:name="_Toc223105323"/>
+      <w:r>
+        <w:rPr>
+          <w:b w:val="0"/>
+          <w:bCs w:val="0"/>
+        </w:rPr>
+        <w:t>Desktop remoto XRDP e ambiente gráfico</w:t>
+      </w:r>
+      <w:bookmarkEnd w:id="19"/>
+      <w:r>
+        <w:rPr>
+          <w:b w:val="0"/>
+          <w:bCs w:val="0"/>
+        </w:rPr>
+        <w:t xml:space="preserve"> </w:t>
+      </w:r>
+    </w:p>
     <w:p/>
+    <w:p>
+      <w:pPr>
+        <w:pStyle w:val="PargrafodaLista"/>
+        <w:numPr>
+          <w:ilvl w:val="2"/>
+          <w:numId w:val="46"/>
+        </w:numPr>
+        <w:rPr>
+          <w:b/>
+          <w:bCs/>
+        </w:rPr>
+      </w:pPr>
+      <w:r>
+        <w:rPr>
+          <w:b/>
+          <w:bCs/>
+        </w:rPr>
+        <w:t xml:space="preserve">(DHCP) </w:t>
+      </w:r>
+      <w:r>
+        <w:rPr>
+          <w:b/>
+          <w:bCs/>
+        </w:rPr>
+        <w:t>Dynamic Host Configuration Protocol</w:t>
+      </w:r>
+    </w:p>
+    <w:p>
+      <w:pPr>
+        <w:pStyle w:val="PargrafodaLista"/>
+        <w:numPr>
+          <w:ilvl w:val="2"/>
+          <w:numId w:val="46"/>
+        </w:numPr>
+        <w:rPr>
+          <w:b/>
+          <w:bCs/>
+        </w:rPr>
+      </w:pPr>
+      <w:r>
+        <w:rPr>
+          <w:b/>
+          <w:bCs/>
+        </w:rPr>
+        <w:t>IP Estático</w:t>
+      </w:r>
+    </w:p>
+    <w:p>
+      <w:pPr>
+        <w:pStyle w:val="PargrafodaLista"/>
+        <w:numPr>
+          <w:ilvl w:val="2"/>
+          <w:numId w:val="46"/>
+        </w:numPr>
+        <w:rPr>
+          <w:b/>
+          <w:bCs/>
+        </w:rPr>
+      </w:pPr>
+      <w:r>
+        <w:rPr>
+          <w:b/>
+          <w:bCs/>
+        </w:rPr>
+        <w:t>DNS — Domain Name System</w:t>
+      </w:r>
+    </w:p>
+    <w:p>
+      <w:pPr>
+        <w:pStyle w:val="PargrafodaLista"/>
+        <w:numPr>
+          <w:ilvl w:val="2"/>
+          <w:numId w:val="46"/>
+        </w:numPr>
+        <w:rPr>
+          <w:b/>
+          <w:bCs/>
+        </w:rPr>
+      </w:pPr>
+      <w:r>
+        <w:rPr>
+          <w:b/>
+          <w:bCs/>
+        </w:rPr>
+        <w:t>Firewall</w:t>
+      </w:r>
+    </w:p>
+    <w:p>
+      <w:pPr>
+        <w:pStyle w:val="PargrafodaLista"/>
+        <w:numPr>
+          <w:ilvl w:val="2"/>
+          <w:numId w:val="46"/>
+        </w:numPr>
+        <w:rPr>
+          <w:b/>
+          <w:bCs/>
+        </w:rPr>
+      </w:pPr>
+      <w:r>
+        <w:rPr>
+          <w:b/>
+          <w:bCs/>
+        </w:rPr>
+        <w:t>WAN e LAN</w:t>
+      </w:r>
+    </w:p>
+    <w:p>
+      <w:pPr>
+        <w:pStyle w:val="PargrafodaLista"/>
+        <w:numPr>
+          <w:ilvl w:val="2"/>
+          <w:numId w:val="46"/>
+        </w:numPr>
+        <w:rPr>
+          <w:b/>
+          <w:bCs/>
+        </w:rPr>
+      </w:pPr>
+      <w:r>
+        <w:rPr>
+          <w:b/>
+          <w:bCs/>
+        </w:rPr>
+        <w:t>Bridge (Br-lan)</w:t>
+      </w:r>
+    </w:p>
+    <w:p>
+      <w:pPr>
+        <w:pStyle w:val="PargrafodaLista"/>
+        <w:numPr>
+          <w:ilvl w:val="2"/>
+          <w:numId w:val="46"/>
+        </w:numPr>
+        <w:rPr>
+          <w:b/>
+          <w:bCs/>
+        </w:rPr>
+      </w:pPr>
+      <w:r>
+        <w:rPr>
+          <w:b/>
+          <w:bCs/>
+        </w:rPr>
+        <w:t>LuCI — Interface Web</w:t>
+      </w:r>
+    </w:p>
+    <w:p>
+      <w:pPr>
+        <w:pStyle w:val="PargrafodaLista"/>
+        <w:numPr>
+          <w:ilvl w:val="2"/>
+          <w:numId w:val="46"/>
+        </w:numPr>
+        <w:rPr>
+          <w:b/>
+          <w:bCs/>
+        </w:rPr>
+      </w:pPr>
+      <w:r>
+        <w:rPr>
+          <w:b/>
+          <w:bCs/>
+        </w:rPr>
+        <w:t>Serviços (Daemons)</w:t>
+      </w:r>
+    </w:p>
+    <w:p/>
+    <w:p/>
+    <w:p/>
+    <w:p>
+      <w:pPr>
+        <w:pStyle w:val="Ttulo1"/>
+        <w:numPr>
+          <w:ilvl w:val="0"/>
+          <w:numId w:val="18"/>
+        </w:numPr>
+      </w:pPr>
+      <w:bookmarkStart w:id="20" w:name="_Toc223105324"/>
+      <w:r>
+        <w:t>Problemas e soluções</w:t>
+      </w:r>
+      <w:bookmarkEnd w:id="20"/>
+    </w:p>
+    <w:p>
+      <w:pPr>
+        <w:pStyle w:val="Ttulo2"/>
+        <w:numPr>
+          <w:ilvl w:val="1"/>
+          <w:numId w:val="18"/>
+        </w:numPr>
+      </w:pPr>
+      <w:bookmarkStart w:id="21" w:name="_Toc223105325"/>
+      <w:r>
+        <w:t>Erros encontrados, como resolver</w:t>
+      </w:r>
+      <w:bookmarkEnd w:id="21"/>
+    </w:p>
+    <w:p>
+      <w:pPr>
+        <w:pStyle w:val="Ttulo2"/>
+        <w:numPr>
+          <w:ilvl w:val="1"/>
+          <w:numId w:val="18"/>
+        </w:numPr>
+      </w:pPr>
+      <w:bookmarkStart w:id="22" w:name="_Toc223105326"/>
+      <w:r>
+        <w:t>Lock de pacotes, Interfaces, autenticação</w:t>
+      </w:r>
+      <w:bookmarkEnd w:id="22"/>
+    </w:p>
+    <w:p/>
+    <w:p/>
+    <w:p/>
+    <w:p/>
+    <w:p>
+      <w:pPr>
+        <w:rPr>
+          <w:sz w:val="24"/>
+          <w:szCs w:val="24"/>
+        </w:rPr>
+      </w:pPr>
+      <w:bookmarkStart w:id="23" w:name="_Toc223105327"/>
+      <w:r>
+        <w:rPr>
+          <w:b/>
+          <w:bCs/>
+        </w:rPr>
+        <w:br w:type="page"/>
+      </w:r>
+    </w:p>
+    <w:p>
+      <w:pPr>
+        <w:pStyle w:val="Ttulo1"/>
+        <w:ind w:left="0"/>
+        <w:rPr>
+          <w:b w:val="0"/>
+          <w:bCs w:val="0"/>
+        </w:rPr>
+      </w:pPr>
+      <w:r>
+        <w:rPr>
+          <w:b w:val="0"/>
+          <w:bCs w:val="0"/>
+        </w:rPr>
+        <w:lastRenderedPageBreak/>
+        <w:t>Stack de Aplicações</w:t>
+      </w:r>
+      <w:bookmarkEnd w:id="23"/>
+    </w:p>
+    <w:p/>
+    <w:p>
+      <w:pPr>
+        <w:pStyle w:val="Ttulo1"/>
+        <w:ind w:left="0"/>
+        <w:rPr>
+          <w:b w:val="0"/>
+          <w:bCs w:val="0"/>
+        </w:rPr>
+      </w:pPr>
+      <w:bookmarkStart w:id="24" w:name="_Toc223105328"/>
+      <w:r>
+        <w:rPr>
+          <w:b w:val="0"/>
+          <w:bCs w:val="0"/>
+        </w:rPr>
+        <w:t>Arquitetura Final do Servidor</w:t>
+      </w:r>
+      <w:bookmarkEnd w:id="24"/>
+    </w:p>
+    <w:p>
+      <w:pPr>
+        <w:pStyle w:val="PargrafodaLista"/>
+        <w:ind w:left="792"/>
+      </w:pPr>
+    </w:p>
+    <w:p>
+      <w:pPr>
+        <w:rPr>
+          <w:sz w:val="24"/>
+          <w:szCs w:val="24"/>
+        </w:rPr>
+      </w:pPr>
+      <w:r>
+        <w:br w:type="page"/>
+      </w:r>
+    </w:p>
+    <w:p>
+      <w:pPr>
+        <w:pStyle w:val="Ttulo1"/>
+        <w:numPr>
+          <w:ilvl w:val="0"/>
+          <w:numId w:val="18"/>
+        </w:numPr>
+      </w:pPr>
+      <w:bookmarkStart w:id="25" w:name="_Toc223105332"/>
+      <w:r>
+        <w:lastRenderedPageBreak/>
+        <w:t>Possiveis melhorias</w:t>
+      </w:r>
+      <w:bookmarkEnd w:id="25"/>
+    </w:p>
+    <w:p/>
+    <w:p>
+      <w:pPr>
+        <w:rPr>
+          <w:b/>
+          <w:bCs/>
+          <w:lang w:val="pt-BR"/>
+        </w:rPr>
+      </w:pPr>
+      <w:r>
+        <w:rPr>
+          <w:b/>
+          <w:bCs/>
+          <w:lang w:val="pt-BR"/>
+        </w:rPr>
+        <w:t>Segurança do servidor</w:t>
+      </w:r>
+    </w:p>
+    <w:p>
+      <w:pPr>
+        <w:rPr>
+          <w:b/>
+          <w:bCs/>
+          <w:lang w:val="pt-BR"/>
+        </w:rPr>
+      </w:pPr>
+    </w:p>
+    <w:p>
+      <w:pPr>
+        <w:jc w:val="both"/>
+        <w:rPr>
+          <w:lang w:val="pt-BR"/>
+        </w:rPr>
+      </w:pPr>
+      <w:r>
+        <w:rPr>
+          <w:lang w:val="pt-BR"/>
+        </w:rPr>
+        <w:t>Apesar de o ambiente estar funcional, identifiquei que a segurança pode ser ampliada com configurações adicionais. Entre as melhorias possíveis estão a implementação de autenticação via chave SSH, desativação do login direto do usuário root e utilização de ferramentas de proteção contra tentativas de acesso indevido, como o Fail2Ban. Também seria interessante configurar um firewall para controlar portas e conexões permitidas. Essas medidas tornariam o ambiente mais próximo de um cenário real de produção.</w:t>
+      </w:r>
+    </w:p>
+    <w:p>
+      <w:pPr>
+        <w:jc w:val="both"/>
+        <w:rPr>
+          <w:lang w:val="pt-BR"/>
+        </w:rPr>
+      </w:pPr>
+    </w:p>
+    <w:p>
+      <w:pPr>
+        <w:jc w:val="both"/>
+        <w:rPr>
+          <w:b/>
+          <w:bCs/>
+          <w:lang w:val="pt-BR"/>
+        </w:rPr>
+      </w:pPr>
+      <w:r>
+        <w:rPr>
+          <w:b/>
+          <w:bCs/>
+          <w:lang w:val="pt-BR"/>
+        </w:rPr>
+        <w:t>Monitoramento do sistema</w:t>
+      </w:r>
+    </w:p>
+    <w:p>
+      <w:pPr>
+        <w:jc w:val="both"/>
+        <w:rPr>
+          <w:b/>
+          <w:bCs/>
+          <w:lang w:val="pt-BR"/>
+        </w:rPr>
+      </w:pPr>
+    </w:p>
+    <w:p>
+      <w:pPr>
+        <w:jc w:val="both"/>
+        <w:rPr>
+          <w:lang w:val="pt-BR"/>
+        </w:rPr>
+      </w:pPr>
+      <w:r>
+        <w:rPr>
+          <w:lang w:val="pt-BR"/>
+        </w:rPr>
+        <w:t>Uma melhoria importante seria a implementação de ferramentas de monitoramento contínuo do servidor. Durante o projeto, o acompanhamento foi feito manualmente, porém ferramentas específicas permitiriam visualizar consumo de CPU, memória, rede e status dos serviços em tempo real. A adoção de soluções de monitoramento ajudaria na identificação preventiva de problemas, permitindo agir antes que falhas impactem o funcionamento do sistema.</w:t>
+      </w:r>
+    </w:p>
+    <w:p>
+      <w:pPr>
+        <w:jc w:val="both"/>
+        <w:rPr>
+          <w:lang w:val="pt-BR"/>
+        </w:rPr>
+      </w:pPr>
+    </w:p>
+    <w:p>
+      <w:pPr>
+        <w:jc w:val="both"/>
+        <w:rPr>
+          <w:b/>
+          <w:bCs/>
+          <w:lang w:val="pt-BR"/>
+        </w:rPr>
+      </w:pPr>
+      <w:r>
+        <w:rPr>
+          <w:b/>
+          <w:bCs/>
+          <w:lang w:val="pt-BR"/>
+        </w:rPr>
+        <w:t>Automação de tarefas administrativas</w:t>
+      </w:r>
+    </w:p>
+    <w:p>
+      <w:pPr>
+        <w:jc w:val="both"/>
+        <w:rPr>
+          <w:b/>
+          <w:bCs/>
+          <w:lang w:val="pt-BR"/>
+        </w:rPr>
+      </w:pPr>
+    </w:p>
+    <w:p>
+      <w:pPr>
+        <w:jc w:val="both"/>
+        <w:rPr>
+          <w:lang w:val="pt-BR"/>
+        </w:rPr>
+      </w:pPr>
+      <w:r>
+        <w:rPr>
+          <w:lang w:val="pt-BR"/>
+        </w:rPr>
+        <w:t>Outra evolução natural do projeto seria automatizar tarefas repetitivas por meio de scripts em Bash. Atualizações periódicas, backups automáticos e verificações de integridade do sistema poderiam ser executadas sem intervenção manual. Isso reduziria erros humanos e aumentaria a eficiência operacional, além de aproximar o ambiente das práticas utilizadas em administração profissional de servidores.</w:t>
+      </w:r>
+    </w:p>
+    <w:p>
+      <w:pPr>
+        <w:jc w:val="both"/>
+        <w:rPr>
+          <w:lang w:val="pt-BR"/>
+        </w:rPr>
+      </w:pPr>
+    </w:p>
+    <w:p>
+      <w:pPr>
+        <w:jc w:val="both"/>
+        <w:rPr>
+          <w:b/>
+          <w:bCs/>
+          <w:lang w:val="pt-BR"/>
+        </w:rPr>
+      </w:pPr>
+      <w:r>
+        <w:rPr>
+          <w:b/>
+          <w:bCs/>
+          <w:lang w:val="pt-BR"/>
+        </w:rPr>
+        <w:t>Aplicação em ambiente real de produção</w:t>
+      </w:r>
+    </w:p>
+    <w:p>
+      <w:pPr>
+        <w:jc w:val="both"/>
+        <w:rPr>
+          <w:b/>
+          <w:bCs/>
+          <w:lang w:val="pt-BR"/>
+        </w:rPr>
+      </w:pPr>
+    </w:p>
+    <w:p>
+      <w:pPr>
+        <w:jc w:val="both"/>
+        <w:rPr>
+          <w:lang w:val="pt-BR"/>
+        </w:rPr>
+      </w:pPr>
+      <w:r>
+        <w:rPr>
+          <w:lang w:val="pt-BR"/>
+        </w:rPr>
+        <w:t>Uma melhoria futura seria aplicar todo o conhecimento adquirido em um cenário real, hospedando aplicações próprias ou projetos experimentais no servidor. Essa etapa permitiria lidar com desafios reais como disponibilidade, acesso externo, segurança contínua e manutenção a longo prazo, consolidando o aprendizado obtido durante o projeto.</w:t>
+      </w:r>
+    </w:p>
+    <w:p>
+      <w:pPr>
+        <w:rPr>
+          <w:b/>
+          <w:bCs/>
+          <w:sz w:val="24"/>
+          <w:szCs w:val="24"/>
+        </w:rPr>
+      </w:pPr>
+    </w:p>
+    <w:p>
+      <w:pPr>
+        <w:rPr>
+          <w:b/>
+          <w:bCs/>
+          <w:sz w:val="24"/>
+          <w:szCs w:val="24"/>
+        </w:rPr>
+      </w:pPr>
+      <w:r>
+        <w:br w:type="page"/>
+      </w:r>
+    </w:p>
+    <w:p>
+      <w:pPr>
+        <w:pStyle w:val="Ttulo1"/>
+        <w:numPr>
+          <w:ilvl w:val="0"/>
+          <w:numId w:val="18"/>
+        </w:numPr>
+      </w:pPr>
+      <w:bookmarkStart w:id="26" w:name="_Toc223105333"/>
+      <w:r>
+        <w:lastRenderedPageBreak/>
+        <w:t>Conclusão</w:t>
+      </w:r>
+      <w:bookmarkEnd w:id="26"/>
+      <w:r>
+        <w:t xml:space="preserve"> </w:t>
+      </w:r>
+    </w:p>
     <w:p>
       <w:pPr>
         <w:pStyle w:val="Ttulo1"/>
@@ -8923,486 +10601,18 @@
           <w:ilvl w:val="1"/>
           <w:numId w:val="18"/>
         </w:numPr>
-        <w:spacing w:before="81"/>
-        <w:rPr>
-          <w:b w:val="0"/>
-          <w:bCs w:val="0"/>
-        </w:rPr>
-      </w:pPr>
-      <w:bookmarkStart w:id="18" w:name="_Toc223105322"/>
-      <w:r>
-        <w:rPr>
-          <w:b w:val="0"/>
-          <w:bCs w:val="0"/>
-        </w:rPr>
-        <w:t>Endurecimento Inicial de Segurança</w:t>
-      </w:r>
-      <w:bookmarkEnd w:id="18"/>
-    </w:p>
-    <w:p>
-      <w:pPr>
-        <w:pStyle w:val="Ttulo1"/>
-        <w:numPr>
-          <w:ilvl w:val="1"/>
-          <w:numId w:val="18"/>
-        </w:numPr>
-        <w:spacing w:before="81"/>
-        <w:rPr>
-          <w:b w:val="0"/>
-          <w:bCs w:val="0"/>
-        </w:rPr>
-      </w:pPr>
-      <w:bookmarkStart w:id="19" w:name="_Toc223105323"/>
-      <w:r>
-        <w:rPr>
-          <w:b w:val="0"/>
-          <w:bCs w:val="0"/>
-        </w:rPr>
-        <w:t>Desktop remoto XRDP e ambiente gráfico</w:t>
-      </w:r>
-      <w:bookmarkEnd w:id="19"/>
-      <w:r>
-        <w:rPr>
-          <w:b w:val="0"/>
-          <w:bCs w:val="0"/>
-        </w:rPr>
+      </w:pPr>
+      <w:bookmarkStart w:id="27" w:name="_Toc223105334"/>
+      <w:r>
+        <w:t>O</w:t>
+      </w:r>
+      <w:r>
         <w:t xml:space="preserve"> </w:t>
       </w:r>
-    </w:p>
-    <w:p/>
-    <w:p/>
-    <w:p>
-      <w:pPr>
-        <w:pStyle w:val="Ttulo1"/>
-        <w:numPr>
-          <w:ilvl w:val="0"/>
-          <w:numId w:val="18"/>
-        </w:numPr>
-      </w:pPr>
-      <w:bookmarkStart w:id="20" w:name="_Toc223105324"/>
-      <w:r>
-        <w:t>Problemas e soluções</w:t>
-      </w:r>
-      <w:bookmarkEnd w:id="20"/>
-    </w:p>
-    <w:p>
-      <w:pPr>
-        <w:pStyle w:val="Ttulo2"/>
-        <w:numPr>
-          <w:ilvl w:val="1"/>
-          <w:numId w:val="18"/>
-        </w:numPr>
-      </w:pPr>
-      <w:bookmarkStart w:id="21" w:name="_Toc223105325"/>
-      <w:r>
-        <w:t>Erros encontrados, como resolver</w:t>
-      </w:r>
-      <w:bookmarkEnd w:id="21"/>
-    </w:p>
-    <w:p/>
-    <w:p/>
-    <w:p>
-      <w:pPr>
-        <w:pStyle w:val="Ttulo2"/>
-        <w:numPr>
-          <w:ilvl w:val="1"/>
-          <w:numId w:val="18"/>
-        </w:numPr>
-      </w:pPr>
-      <w:bookmarkStart w:id="22" w:name="_Toc223105326"/>
-      <w:r>
-        <w:t>Lock de pacotes, Interfaces, autenticação</w:t>
-      </w:r>
-      <w:bookmarkEnd w:id="22"/>
-    </w:p>
-    <w:p/>
-    <w:p/>
-    <w:p/>
-    <w:p/>
-    <w:p>
-      <w:pPr>
-        <w:pStyle w:val="Ttulo1"/>
-        <w:numPr>
-          <w:ilvl w:val="1"/>
-          <w:numId w:val="18"/>
-        </w:numPr>
-        <w:rPr>
-          <w:b w:val="0"/>
-          <w:bCs w:val="0"/>
-        </w:rPr>
-      </w:pPr>
-      <w:bookmarkStart w:id="23" w:name="_Toc223105327"/>
-      <w:r>
-        <w:rPr>
-          <w:b w:val="0"/>
-          <w:bCs w:val="0"/>
-        </w:rPr>
-        <w:t>Stack de Aplicações</w:t>
-      </w:r>
-      <w:bookmarkEnd w:id="23"/>
-    </w:p>
-    <w:p/>
-    <w:p>
-      <w:pPr>
-        <w:pStyle w:val="Ttulo1"/>
-        <w:numPr>
-          <w:ilvl w:val="1"/>
-          <w:numId w:val="18"/>
-        </w:numPr>
-        <w:rPr>
-          <w:b w:val="0"/>
-          <w:bCs w:val="0"/>
-        </w:rPr>
-      </w:pPr>
-      <w:bookmarkStart w:id="24" w:name="_Toc223105328"/>
-      <w:r>
-        <w:rPr>
-          <w:b w:val="0"/>
-          <w:bCs w:val="0"/>
-        </w:rPr>
-        <w:t>Arquitetura Final do Servidor</w:t>
-      </w:r>
-      <w:bookmarkEnd w:id="24"/>
-    </w:p>
-    <w:p>
-      <w:pPr>
-        <w:pStyle w:val="PargrafodaLista"/>
-        <w:ind w:left="792"/>
-      </w:pPr>
-    </w:p>
-    <w:p>
-      <w:pPr>
-        <w:rPr>
-          <w:sz w:val="24"/>
-          <w:szCs w:val="24"/>
-        </w:rPr>
-      </w:pPr>
-      <w:r>
-        <w:br w:type="page"/>
-      </w:r>
-    </w:p>
-    <w:p>
-      <w:pPr>
-        <w:pStyle w:val="Ttulo1"/>
-        <w:numPr>
-          <w:ilvl w:val="0"/>
-          <w:numId w:val="18"/>
-        </w:numPr>
-      </w:pPr>
-      <w:bookmarkStart w:id="25" w:name="_Toc223105329"/>
-      <w:r>
-        <w:lastRenderedPageBreak/>
-        <w:t>Serviços e Testes</w:t>
-      </w:r>
-      <w:bookmarkEnd w:id="25"/>
-    </w:p>
-    <w:p>
-      <w:pPr>
-        <w:pStyle w:val="Ttulo1"/>
-        <w:numPr>
-          <w:ilvl w:val="1"/>
-          <w:numId w:val="18"/>
-        </w:numPr>
-      </w:pPr>
-      <w:bookmarkStart w:id="26" w:name="_Toc223105330"/>
-      <w:r>
-        <w:t>Servidor web/API/bots</w:t>
-      </w:r>
-      <w:bookmarkEnd w:id="26"/>
-    </w:p>
-    <w:p>
-      <w:pPr>
-        <w:pStyle w:val="Ttulo1"/>
-        <w:numPr>
-          <w:ilvl w:val="1"/>
-          <w:numId w:val="18"/>
-        </w:numPr>
-      </w:pPr>
-      <w:bookmarkStart w:id="27" w:name="_Toc223105331"/>
-      <w:r>
-        <w:t>Laboratório de rede</w:t>
+      <w:r>
+        <w:t>que foi aprendido</w:t>
       </w:r>
       <w:bookmarkEnd w:id="27"/>
-    </w:p>
-    <w:p>
-      <w:pPr>
-        <w:rPr>
-          <w:b/>
-          <w:bCs/>
-          <w:sz w:val="24"/>
-          <w:szCs w:val="24"/>
-        </w:rPr>
-      </w:pPr>
-      <w:r>
-        <w:br w:type="page"/>
-      </w:r>
-    </w:p>
-    <w:p>
-      <w:pPr>
-        <w:pStyle w:val="Ttulo1"/>
-        <w:numPr>
-          <w:ilvl w:val="0"/>
-          <w:numId w:val="18"/>
-        </w:numPr>
-      </w:pPr>
-      <w:bookmarkStart w:id="28" w:name="_Toc223105332"/>
-      <w:r>
-        <w:lastRenderedPageBreak/>
-        <w:t>Possiveis melhorias</w:t>
-      </w:r>
-      <w:bookmarkEnd w:id="28"/>
-    </w:p>
-    <w:p/>
-    <w:p>
-      <w:pPr>
-        <w:rPr>
-          <w:b/>
-          <w:bCs/>
-          <w:lang w:val="pt-BR"/>
-        </w:rPr>
-      </w:pPr>
-      <w:r>
-        <w:rPr>
-          <w:b/>
-          <w:bCs/>
-          <w:lang w:val="pt-BR"/>
-        </w:rPr>
-        <w:t>Segurança do servidor</w:t>
-      </w:r>
-    </w:p>
-    <w:p>
-      <w:pPr>
-        <w:rPr>
-          <w:b/>
-          <w:bCs/>
-          <w:lang w:val="pt-BR"/>
-        </w:rPr>
-      </w:pPr>
-    </w:p>
-    <w:p>
-      <w:pPr>
-        <w:jc w:val="both"/>
-        <w:rPr>
-          <w:lang w:val="pt-BR"/>
-        </w:rPr>
-      </w:pPr>
-      <w:r>
-        <w:rPr>
-          <w:lang w:val="pt-BR"/>
-        </w:rPr>
-        <w:t>Apesar de o ambiente estar funcional, identifiquei que a segurança pode ser ampliada com configurações adicionais. Entre as melhorias possíveis estão a implementação de autenticação via chave SSH, desativação do login direto do usuário root e utilização de ferramentas de proteção contra tentativas de acesso indevido, como o Fail2Ban. Também seria interessante configurar um firewall para controlar portas e conexões permitidas. Essas medidas tornariam o ambiente mais próximo de um cenário real de produção.</w:t>
-      </w:r>
-    </w:p>
-    <w:p>
-      <w:pPr>
-        <w:jc w:val="both"/>
-        <w:rPr>
-          <w:lang w:val="pt-BR"/>
-        </w:rPr>
-      </w:pPr>
-    </w:p>
-    <w:p>
-      <w:pPr>
-        <w:jc w:val="both"/>
-        <w:rPr>
-          <w:b/>
-          <w:bCs/>
-          <w:lang w:val="pt-BR"/>
-        </w:rPr>
-      </w:pPr>
-      <w:r>
-        <w:rPr>
-          <w:b/>
-          <w:bCs/>
-          <w:lang w:val="pt-BR"/>
-        </w:rPr>
-        <w:t>Monitoramento do sistema</w:t>
-      </w:r>
-    </w:p>
-    <w:p>
-      <w:pPr>
-        <w:jc w:val="both"/>
-        <w:rPr>
-          <w:b/>
-          <w:bCs/>
-          <w:lang w:val="pt-BR"/>
-        </w:rPr>
-      </w:pPr>
-    </w:p>
-    <w:p>
-      <w:pPr>
-        <w:jc w:val="both"/>
-        <w:rPr>
-          <w:lang w:val="pt-BR"/>
-        </w:rPr>
-      </w:pPr>
-      <w:r>
-        <w:rPr>
-          <w:lang w:val="pt-BR"/>
-        </w:rPr>
-        <w:t>Uma melhoria importante seria a implementação de ferramentas de monitoramento contínuo do servidor. Durante o projeto, o acompanhamento foi feito manualmente, porém ferramentas específicas permitiriam visualizar consumo de CPU, memória, rede e status dos serviços em tempo real. A adoção de soluções de monitoramento ajudaria na identificação preventiva de problemas, permitindo agir antes que falhas impactem o funcionamento do sistema.</w:t>
-      </w:r>
-    </w:p>
-    <w:p>
-      <w:pPr>
-        <w:jc w:val="both"/>
-        <w:rPr>
-          <w:lang w:val="pt-BR"/>
-        </w:rPr>
-      </w:pPr>
-    </w:p>
-    <w:p>
-      <w:pPr>
-        <w:jc w:val="both"/>
-        <w:rPr>
-          <w:b/>
-          <w:bCs/>
-          <w:lang w:val="pt-BR"/>
-        </w:rPr>
-      </w:pPr>
-      <w:r>
-        <w:rPr>
-          <w:b/>
-          <w:bCs/>
-          <w:lang w:val="pt-BR"/>
-        </w:rPr>
-        <w:t>Automação de tarefas administrativas</w:t>
-      </w:r>
-    </w:p>
-    <w:p>
-      <w:pPr>
-        <w:jc w:val="both"/>
-        <w:rPr>
-          <w:b/>
-          <w:bCs/>
-          <w:lang w:val="pt-BR"/>
-        </w:rPr>
-      </w:pPr>
-    </w:p>
-    <w:p>
-      <w:pPr>
-        <w:jc w:val="both"/>
-        <w:rPr>
-          <w:lang w:val="pt-BR"/>
-        </w:rPr>
-      </w:pPr>
-      <w:r>
-        <w:rPr>
-          <w:lang w:val="pt-BR"/>
-        </w:rPr>
-        <w:t>Outra evolução natural do projeto seria automatizar tarefas repetitivas por meio de scripts em Bash. Atualizações periódicas, backups automáticos e verificações de integridade do sistema poderiam ser executadas sem intervenção manual. Isso reduziria erros humanos e aumentaria a eficiência operacional, além de aproximar o ambiente das práticas utilizadas em administração profissional de servidores.</w:t>
-      </w:r>
-    </w:p>
-    <w:p>
-      <w:pPr>
-        <w:jc w:val="both"/>
-        <w:rPr>
-          <w:lang w:val="pt-BR"/>
-        </w:rPr>
-      </w:pPr>
-    </w:p>
-    <w:p>
-      <w:pPr>
-        <w:jc w:val="both"/>
-        <w:rPr>
-          <w:b/>
-          <w:bCs/>
-          <w:lang w:val="pt-BR"/>
-        </w:rPr>
-      </w:pPr>
-      <w:r>
-        <w:rPr>
-          <w:b/>
-          <w:bCs/>
-          <w:lang w:val="pt-BR"/>
-        </w:rPr>
-        <w:t>Aplicação em ambiente real de produção</w:t>
-      </w:r>
-    </w:p>
-    <w:p>
-      <w:pPr>
-        <w:jc w:val="both"/>
-        <w:rPr>
-          <w:b/>
-          <w:bCs/>
-          <w:lang w:val="pt-BR"/>
-        </w:rPr>
-      </w:pPr>
-    </w:p>
-    <w:p>
-      <w:pPr>
-        <w:jc w:val="both"/>
-        <w:rPr>
-          <w:lang w:val="pt-BR"/>
-        </w:rPr>
-      </w:pPr>
-      <w:r>
-        <w:rPr>
-          <w:lang w:val="pt-BR"/>
-        </w:rPr>
-        <w:t>Uma melhoria futura seria aplicar todo o conhecimento adquirido em um cenário real, hospedando aplicações próprias ou projetos experimentais no servidor. Essa etapa permitiria lidar com desafios reais como disponibilidade, acesso externo, segurança contínua e manutenção a longo prazo, consolidando o aprendizado obtido durante o projeto.</w:t>
-      </w:r>
-    </w:p>
-    <w:p>
-      <w:pPr>
-        <w:rPr>
-          <w:b/>
-          <w:bCs/>
-          <w:sz w:val="24"/>
-          <w:szCs w:val="24"/>
-        </w:rPr>
-      </w:pPr>
-    </w:p>
-    <w:p>
-      <w:pPr>
-        <w:rPr>
-          <w:b/>
-          <w:bCs/>
-          <w:sz w:val="24"/>
-          <w:szCs w:val="24"/>
-        </w:rPr>
-      </w:pPr>
-      <w:r>
-        <w:br w:type="page"/>
-      </w:r>
-    </w:p>
-    <w:p>
-      <w:pPr>
-        <w:pStyle w:val="Ttulo1"/>
-        <w:numPr>
-          <w:ilvl w:val="0"/>
-          <w:numId w:val="18"/>
-        </w:numPr>
-      </w:pPr>
-      <w:bookmarkStart w:id="29" w:name="_Toc223105333"/>
-      <w:r>
-        <w:lastRenderedPageBreak/>
-        <w:t>Conclusão</w:t>
-      </w:r>
-      <w:bookmarkEnd w:id="29"/>
-      <w:r>
-        <w:t xml:space="preserve"> </w:t>
-      </w:r>
-    </w:p>
-    <w:p>
-      <w:pPr>
-        <w:pStyle w:val="Ttulo1"/>
-        <w:numPr>
-          <w:ilvl w:val="1"/>
-          <w:numId w:val="18"/>
-        </w:numPr>
-      </w:pPr>
-      <w:bookmarkStart w:id="30" w:name="_Toc223105334"/>
-      <w:r>
-        <w:t>O</w:t>
-      </w:r>
-      <w:r>
-        <w:t xml:space="preserve"> </w:t>
-      </w:r>
-      <w:r>
-        <w:t>que foi aprendido</w:t>
-      </w:r>
-      <w:bookmarkEnd w:id="30"/>
     </w:p>
     <w:p/>
     <w:p>
@@ -10154,14 +11364,14 @@
           <w:numId w:val="18"/>
         </w:numPr>
       </w:pPr>
-      <w:bookmarkStart w:id="31" w:name="_Toc223105335"/>
+      <w:bookmarkStart w:id="28" w:name="_Toc223105335"/>
       <w:r>
         <w:lastRenderedPageBreak/>
         <w:t>Referências</w:t>
       </w:r>
-      <w:bookmarkStart w:id="32" w:name="_7z97l1gcgeqn" w:colFirst="0" w:colLast="0"/>
-      <w:bookmarkEnd w:id="31"/>
-      <w:bookmarkEnd w:id="32"/>
+      <w:bookmarkStart w:id="29" w:name="_7z97l1gcgeqn" w:colFirst="0" w:colLast="0"/>
+      <w:bookmarkEnd w:id="28"/>
+      <w:bookmarkEnd w:id="29"/>
     </w:p>
     <w:p/>
     <w:p>
@@ -11680,6 +12890,92 @@
     </w:lvl>
   </w:abstractNum>
   <w:abstractNum w:abstractNumId="10" w15:restartNumberingAfterBreak="0">
+    <w:nsid w:val="1A364A75"/>
+    <w:multiLevelType w:val="hybridMultilevel"/>
+    <w:tmpl w:val="530EA380"/>
+    <w:lvl w:ilvl="0" w:tplc="0416000F">
+      <w:start w:val="1"/>
+      <w:numFmt w:val="decimal"/>
+      <w:lvlText w:val="%1."/>
+      <w:lvlJc w:val="left"/>
+      <w:pPr>
+        <w:ind w:left="720" w:hanging="360"/>
+      </w:pPr>
+    </w:lvl>
+    <w:lvl w:ilvl="1" w:tplc="04160019" w:tentative="1">
+      <w:start w:val="1"/>
+      <w:numFmt w:val="lowerLetter"/>
+      <w:lvlText w:val="%2."/>
+      <w:lvlJc w:val="left"/>
+      <w:pPr>
+        <w:ind w:left="1440" w:hanging="360"/>
+      </w:pPr>
+    </w:lvl>
+    <w:lvl w:ilvl="2" w:tplc="0416001B" w:tentative="1">
+      <w:start w:val="1"/>
+      <w:numFmt w:val="lowerRoman"/>
+      <w:lvlText w:val="%3."/>
+      <w:lvlJc w:val="right"/>
+      <w:pPr>
+        <w:ind w:left="2160" w:hanging="180"/>
+      </w:pPr>
+    </w:lvl>
+    <w:lvl w:ilvl="3" w:tplc="0416000F" w:tentative="1">
+      <w:start w:val="1"/>
+      <w:numFmt w:val="decimal"/>
+      <w:lvlText w:val="%4."/>
+      <w:lvlJc w:val="left"/>
+      <w:pPr>
+        <w:ind w:left="2880" w:hanging="360"/>
+      </w:pPr>
+    </w:lvl>
+    <w:lvl w:ilvl="4" w:tplc="04160019" w:tentative="1">
+      <w:start w:val="1"/>
+      <w:numFmt w:val="lowerLetter"/>
+      <w:lvlText w:val="%5."/>
+      <w:lvlJc w:val="left"/>
+      <w:pPr>
+        <w:ind w:left="3600" w:hanging="360"/>
+      </w:pPr>
+    </w:lvl>
+    <w:lvl w:ilvl="5" w:tplc="0416001B" w:tentative="1">
+      <w:start w:val="1"/>
+      <w:numFmt w:val="lowerRoman"/>
+      <w:lvlText w:val="%6."/>
+      <w:lvlJc w:val="right"/>
+      <w:pPr>
+        <w:ind w:left="4320" w:hanging="180"/>
+      </w:pPr>
+    </w:lvl>
+    <w:lvl w:ilvl="6" w:tplc="0416000F" w:tentative="1">
+      <w:start w:val="1"/>
+      <w:numFmt w:val="decimal"/>
+      <w:lvlText w:val="%7."/>
+      <w:lvlJc w:val="left"/>
+      <w:pPr>
+        <w:ind w:left="5040" w:hanging="360"/>
+      </w:pPr>
+    </w:lvl>
+    <w:lvl w:ilvl="7" w:tplc="04160019" w:tentative="1">
+      <w:start w:val="1"/>
+      <w:numFmt w:val="lowerLetter"/>
+      <w:lvlText w:val="%8."/>
+      <w:lvlJc w:val="left"/>
+      <w:pPr>
+        <w:ind w:left="5760" w:hanging="360"/>
+      </w:pPr>
+    </w:lvl>
+    <w:lvl w:ilvl="8" w:tplc="0416001B" w:tentative="1">
+      <w:start w:val="1"/>
+      <w:numFmt w:val="lowerRoman"/>
+      <w:lvlText w:val="%9."/>
+      <w:lvlJc w:val="right"/>
+      <w:pPr>
+        <w:ind w:left="6480" w:hanging="180"/>
+      </w:pPr>
+    </w:lvl>
+  </w:abstractNum>
+  <w:abstractNum w:abstractNumId="11" w15:restartNumberingAfterBreak="0">
     <w:nsid w:val="1F512F9A"/>
     <w:multiLevelType w:val="multilevel"/>
     <w:tmpl w:val="B7CE0E1A"/>
@@ -11810,7 +13106,7 @@
       </w:rPr>
     </w:lvl>
   </w:abstractNum>
-  <w:abstractNum w:abstractNumId="11" w15:restartNumberingAfterBreak="0">
+  <w:abstractNum w:abstractNumId="12" w15:restartNumberingAfterBreak="0">
     <w:nsid w:val="208B2E69"/>
     <w:multiLevelType w:val="hybridMultilevel"/>
     <w:tmpl w:val="36F0E890"/>
@@ -11923,7 +13219,7 @@
       </w:rPr>
     </w:lvl>
   </w:abstractNum>
-  <w:abstractNum w:abstractNumId="12" w15:restartNumberingAfterBreak="0">
+  <w:abstractNum w:abstractNumId="13" w15:restartNumberingAfterBreak="0">
     <w:nsid w:val="22F24768"/>
     <w:multiLevelType w:val="hybridMultilevel"/>
     <w:tmpl w:val="5998AAEE"/>
@@ -12036,7 +13332,7 @@
       </w:rPr>
     </w:lvl>
   </w:abstractNum>
-  <w:abstractNum w:abstractNumId="13" w15:restartNumberingAfterBreak="0">
+  <w:abstractNum w:abstractNumId="14" w15:restartNumberingAfterBreak="0">
     <w:nsid w:val="245F0121"/>
     <w:multiLevelType w:val="multilevel"/>
     <w:tmpl w:val="002A835A"/>
@@ -12167,7 +13463,120 @@
       </w:rPr>
     </w:lvl>
   </w:abstractNum>
-  <w:abstractNum w:abstractNumId="14" w15:restartNumberingAfterBreak="0">
+  <w:abstractNum w:abstractNumId="15" w15:restartNumberingAfterBreak="0">
+    <w:nsid w:val="25D22D21"/>
+    <w:multiLevelType w:val="multilevel"/>
+    <w:tmpl w:val="1592F104"/>
+    <w:lvl w:ilvl="0">
+      <w:start w:val="3"/>
+      <w:numFmt w:val="decimal"/>
+      <w:lvlText w:val="%1"/>
+      <w:lvlJc w:val="left"/>
+      <w:pPr>
+        <w:ind w:left="360" w:hanging="360"/>
+      </w:pPr>
+      <w:rPr>
+        <w:rFonts w:hint="default"/>
+      </w:rPr>
+    </w:lvl>
+    <w:lvl w:ilvl="1">
+      <w:start w:val="1"/>
+      <w:numFmt w:val="decimal"/>
+      <w:lvlText w:val="%1.%2"/>
+      <w:lvlJc w:val="left"/>
+      <w:pPr>
+        <w:ind w:left="1080" w:hanging="360"/>
+      </w:pPr>
+      <w:rPr>
+        <w:rFonts w:hint="default"/>
+      </w:rPr>
+    </w:lvl>
+    <w:lvl w:ilvl="2">
+      <w:start w:val="1"/>
+      <w:numFmt w:val="decimal"/>
+      <w:lvlText w:val="%1.%2.%3"/>
+      <w:lvlJc w:val="left"/>
+      <w:pPr>
+        <w:ind w:left="2160" w:hanging="720"/>
+      </w:pPr>
+      <w:rPr>
+        <w:rFonts w:hint="default"/>
+      </w:rPr>
+    </w:lvl>
+    <w:lvl w:ilvl="3">
+      <w:start w:val="1"/>
+      <w:numFmt w:val="decimal"/>
+      <w:lvlText w:val="%1.%2.%3.%4"/>
+      <w:lvlJc w:val="left"/>
+      <w:pPr>
+        <w:ind w:left="2880" w:hanging="720"/>
+      </w:pPr>
+      <w:rPr>
+        <w:rFonts w:hint="default"/>
+      </w:rPr>
+    </w:lvl>
+    <w:lvl w:ilvl="4">
+      <w:start w:val="1"/>
+      <w:numFmt w:val="decimal"/>
+      <w:lvlText w:val="%1.%2.%3.%4.%5"/>
+      <w:lvlJc w:val="left"/>
+      <w:pPr>
+        <w:ind w:left="3960" w:hanging="1080"/>
+      </w:pPr>
+      <w:rPr>
+        <w:rFonts w:hint="default"/>
+      </w:rPr>
+    </w:lvl>
+    <w:lvl w:ilvl="5">
+      <w:start w:val="1"/>
+      <w:numFmt w:val="decimal"/>
+      <w:lvlText w:val="%1.%2.%3.%4.%5.%6"/>
+      <w:lvlJc w:val="left"/>
+      <w:pPr>
+        <w:ind w:left="4680" w:hanging="1080"/>
+      </w:pPr>
+      <w:rPr>
+        <w:rFonts w:hint="default"/>
+      </w:rPr>
+    </w:lvl>
+    <w:lvl w:ilvl="6">
+      <w:start w:val="1"/>
+      <w:numFmt w:val="decimal"/>
+      <w:lvlText w:val="%1.%2.%3.%4.%5.%6.%7"/>
+      <w:lvlJc w:val="left"/>
+      <w:pPr>
+        <w:ind w:left="5760" w:hanging="1440"/>
+      </w:pPr>
+      <w:rPr>
+        <w:rFonts w:hint="default"/>
+      </w:rPr>
+    </w:lvl>
+    <w:lvl w:ilvl="7">
+      <w:start w:val="1"/>
+      <w:numFmt w:val="decimal"/>
+      <w:lvlText w:val="%1.%2.%3.%4.%5.%6.%7.%8"/>
+      <w:lvlJc w:val="left"/>
+      <w:pPr>
+        <w:ind w:left="6480" w:hanging="1440"/>
+      </w:pPr>
+      <w:rPr>
+        <w:rFonts w:hint="default"/>
+      </w:rPr>
+    </w:lvl>
+    <w:lvl w:ilvl="8">
+      <w:start w:val="1"/>
+      <w:numFmt w:val="decimal"/>
+      <w:lvlText w:val="%1.%2.%3.%4.%5.%6.%7.%8.%9"/>
+      <w:lvlJc w:val="left"/>
+      <w:pPr>
+        <w:ind w:left="7560" w:hanging="1800"/>
+      </w:pPr>
+      <w:rPr>
+        <w:rFonts w:hint="default"/>
+      </w:rPr>
+    </w:lvl>
+  </w:abstractNum>
+  <w:abstractNum w:abstractNumId="16" w15:restartNumberingAfterBreak="0">
     <w:nsid w:val="28487C56"/>
     <w:multiLevelType w:val="multilevel"/>
     <w:tmpl w:val="964C8DDA"/>
@@ -12280,7 +13689,7 @@
       </w:rPr>
     </w:lvl>
   </w:abstractNum>
-  <w:abstractNum w:abstractNumId="15" w15:restartNumberingAfterBreak="0">
+  <w:abstractNum w:abstractNumId="17" w15:restartNumberingAfterBreak="0">
     <w:nsid w:val="289471C0"/>
     <w:multiLevelType w:val="multilevel"/>
     <w:tmpl w:val="57445EF8"/>
@@ -12411,7 +13820,7 @@
       </w:rPr>
     </w:lvl>
   </w:abstractNum>
-  <w:abstractNum w:abstractNumId="16" w15:restartNumberingAfterBreak="0">
+  <w:abstractNum w:abstractNumId="18" w15:restartNumberingAfterBreak="0">
     <w:nsid w:val="29B40799"/>
     <w:multiLevelType w:val="hybridMultilevel"/>
     <w:tmpl w:val="695A0ABE"/>
@@ -12524,7 +13933,7 @@
       </w:rPr>
     </w:lvl>
   </w:abstractNum>
-  <w:abstractNum w:abstractNumId="17" w15:restartNumberingAfterBreak="0">
+  <w:abstractNum w:abstractNumId="19" w15:restartNumberingAfterBreak="0">
     <w:nsid w:val="3592596C"/>
     <w:multiLevelType w:val="hybridMultilevel"/>
     <w:tmpl w:val="8D266048"/>
@@ -12610,7 +14019,93 @@
       </w:pPr>
     </w:lvl>
   </w:abstractNum>
-  <w:abstractNum w:abstractNumId="18" w15:restartNumberingAfterBreak="0">
+  <w:abstractNum w:abstractNumId="20" w15:restartNumberingAfterBreak="0">
+    <w:nsid w:val="35D20935"/>
+    <w:multiLevelType w:val="hybridMultilevel"/>
+    <w:tmpl w:val="C54EFABE"/>
+    <w:lvl w:ilvl="0" w:tplc="0416000F">
+      <w:start w:val="1"/>
+      <w:numFmt w:val="decimal"/>
+      <w:lvlText w:val="%1."/>
+      <w:lvlJc w:val="left"/>
+      <w:pPr>
+        <w:ind w:left="720" w:hanging="360"/>
+      </w:pPr>
+    </w:lvl>
+    <w:lvl w:ilvl="1" w:tplc="04160019" w:tentative="1">
+      <w:start w:val="1"/>
+      <w:numFmt w:val="lowerLetter"/>
+      <w:lvlText w:val="%2."/>
+      <w:lvlJc w:val="left"/>
+      <w:pPr>
+        <w:ind w:left="1440" w:hanging="360"/>
+      </w:pPr>
+    </w:lvl>
+    <w:lvl w:ilvl="2" w:tplc="0416001B" w:tentative="1">
+      <w:start w:val="1"/>
+      <w:numFmt w:val="lowerRoman"/>
+      <w:lvlText w:val="%3."/>
+      <w:lvlJc w:val="right"/>
+      <w:pPr>
+        <w:ind w:left="2160" w:hanging="180"/>
+      </w:pPr>
+    </w:lvl>
+    <w:lvl w:ilvl="3" w:tplc="0416000F" w:tentative="1">
+      <w:start w:val="1"/>
+      <w:numFmt w:val="decimal"/>
+      <w:lvlText w:val="%4."/>
+      <w:lvlJc w:val="left"/>
+      <w:pPr>
+        <w:ind w:left="2880" w:hanging="360"/>
+      </w:pPr>
+    </w:lvl>
+    <w:lvl w:ilvl="4" w:tplc="04160019" w:tentative="1">
+      <w:start w:val="1"/>
+      <w:numFmt w:val="lowerLetter"/>
+      <w:lvlText w:val="%5."/>
+      <w:lvlJc w:val="left"/>
+      <w:pPr>
+        <w:ind w:left="3600" w:hanging="360"/>
+      </w:pPr>
+    </w:lvl>
+    <w:lvl w:ilvl="5" w:tplc="0416001B" w:tentative="1">
+      <w:start w:val="1"/>
+      <w:numFmt w:val="lowerRoman"/>
+      <w:lvlText w:val="%6."/>
+      <w:lvlJc w:val="right"/>
+      <w:pPr>
+        <w:ind w:left="4320" w:hanging="180"/>
+      </w:pPr>
+    </w:lvl>
+    <w:lvl w:ilvl="6" w:tplc="0416000F" w:tentative="1">
+      <w:start w:val="1"/>
+      <w:numFmt w:val="decimal"/>
+      <w:lvlText w:val="%7."/>
+      <w:lvlJc w:val="left"/>
+      <w:pPr>
+        <w:ind w:left="5040" w:hanging="360"/>
+      </w:pPr>
+    </w:lvl>
+    <w:lvl w:ilvl="7" w:tplc="04160019" w:tentative="1">
+      <w:start w:val="1"/>
+      <w:numFmt w:val="lowerLetter"/>
+      <w:lvlText w:val="%8."/>
+      <w:lvlJc w:val="left"/>
+      <w:pPr>
+        <w:ind w:left="5760" w:hanging="360"/>
+      </w:pPr>
+    </w:lvl>
+    <w:lvl w:ilvl="8" w:tplc="0416001B" w:tentative="1">
+      <w:start w:val="1"/>
+      <w:numFmt w:val="lowerRoman"/>
+      <w:lvlText w:val="%9."/>
+      <w:lvlJc w:val="right"/>
+      <w:pPr>
+        <w:ind w:left="6480" w:hanging="180"/>
+      </w:pPr>
+    </w:lvl>
+  </w:abstractNum>
+  <w:abstractNum w:abstractNumId="21" w15:restartNumberingAfterBreak="0">
     <w:nsid w:val="3A093C85"/>
     <w:multiLevelType w:val="multilevel"/>
     <w:tmpl w:val="D94015EA"/>
@@ -12759,7 +14254,7 @@
       </w:rPr>
     </w:lvl>
   </w:abstractNum>
-  <w:abstractNum w:abstractNumId="19" w15:restartNumberingAfterBreak="0">
+  <w:abstractNum w:abstractNumId="22" w15:restartNumberingAfterBreak="0">
     <w:nsid w:val="3B782DA6"/>
     <w:multiLevelType w:val="multilevel"/>
     <w:tmpl w:val="04EE5DCA"/>
@@ -12908,7 +14403,7 @@
       </w:rPr>
     </w:lvl>
   </w:abstractNum>
-  <w:abstractNum w:abstractNumId="20" w15:restartNumberingAfterBreak="0">
+  <w:abstractNum w:abstractNumId="23" w15:restartNumberingAfterBreak="0">
     <w:nsid w:val="3D790DF4"/>
     <w:multiLevelType w:val="multilevel"/>
     <w:tmpl w:val="1750D78C"/>
@@ -13057,7 +14552,7 @@
       </w:rPr>
     </w:lvl>
   </w:abstractNum>
-  <w:abstractNum w:abstractNumId="21" w15:restartNumberingAfterBreak="0">
+  <w:abstractNum w:abstractNumId="24" w15:restartNumberingAfterBreak="0">
     <w:nsid w:val="3F6B19FD"/>
     <w:multiLevelType w:val="multilevel"/>
     <w:tmpl w:val="729410A0"/>
@@ -13188,7 +14683,7 @@
       </w:rPr>
     </w:lvl>
   </w:abstractNum>
-  <w:abstractNum w:abstractNumId="22" w15:restartNumberingAfterBreak="0">
+  <w:abstractNum w:abstractNumId="25" w15:restartNumberingAfterBreak="0">
     <w:nsid w:val="402A538D"/>
     <w:multiLevelType w:val="multilevel"/>
     <w:tmpl w:val="2D461BD0"/>
@@ -13274,7 +14769,7 @@
       </w:pPr>
     </w:lvl>
   </w:abstractNum>
-  <w:abstractNum w:abstractNumId="23" w15:restartNumberingAfterBreak="0">
+  <w:abstractNum w:abstractNumId="26" w15:restartNumberingAfterBreak="0">
     <w:nsid w:val="40EA12AF"/>
     <w:multiLevelType w:val="multilevel"/>
     <w:tmpl w:val="CC06B5FE"/>
@@ -13405,7 +14900,7 @@
       </w:rPr>
     </w:lvl>
   </w:abstractNum>
-  <w:abstractNum w:abstractNumId="24" w15:restartNumberingAfterBreak="0">
+  <w:abstractNum w:abstractNumId="27" w15:restartNumberingAfterBreak="0">
     <w:nsid w:val="42E223A9"/>
     <w:multiLevelType w:val="hybridMultilevel"/>
     <w:tmpl w:val="6E261B9A"/>
@@ -13491,7 +14986,7 @@
       </w:pPr>
     </w:lvl>
   </w:abstractNum>
-  <w:abstractNum w:abstractNumId="25" w15:restartNumberingAfterBreak="0">
+  <w:abstractNum w:abstractNumId="28" w15:restartNumberingAfterBreak="0">
     <w:nsid w:val="49226C3E"/>
     <w:multiLevelType w:val="multilevel"/>
     <w:tmpl w:val="A3DA5BB2"/>
@@ -13622,7 +15117,7 @@
       </w:rPr>
     </w:lvl>
   </w:abstractNum>
-  <w:abstractNum w:abstractNumId="26" w15:restartNumberingAfterBreak="0">
+  <w:abstractNum w:abstractNumId="29" w15:restartNumberingAfterBreak="0">
     <w:nsid w:val="49B433A7"/>
     <w:multiLevelType w:val="multilevel"/>
     <w:tmpl w:val="8FB0D85A"/>
@@ -13753,7 +15248,7 @@
       </w:rPr>
     </w:lvl>
   </w:abstractNum>
-  <w:abstractNum w:abstractNumId="27" w15:restartNumberingAfterBreak="0">
+  <w:abstractNum w:abstractNumId="30" w15:restartNumberingAfterBreak="0">
     <w:nsid w:val="4D1147E1"/>
     <w:multiLevelType w:val="multilevel"/>
     <w:tmpl w:val="83444484"/>
@@ -13884,7 +15379,7 @@
       </w:rPr>
     </w:lvl>
   </w:abstractNum>
-  <w:abstractNum w:abstractNumId="28" w15:restartNumberingAfterBreak="0">
+  <w:abstractNum w:abstractNumId="31" w15:restartNumberingAfterBreak="0">
     <w:nsid w:val="5225202C"/>
     <w:multiLevelType w:val="multilevel"/>
     <w:tmpl w:val="FF9CD142"/>
@@ -14033,7 +15528,7 @@
       </w:rPr>
     </w:lvl>
   </w:abstractNum>
-  <w:abstractNum w:abstractNumId="29" w15:restartNumberingAfterBreak="0">
+  <w:abstractNum w:abstractNumId="32" w15:restartNumberingAfterBreak="0">
     <w:nsid w:val="54593010"/>
     <w:multiLevelType w:val="multilevel"/>
     <w:tmpl w:val="3F82C278"/>
@@ -14182,7 +15677,7 @@
       </w:rPr>
     </w:lvl>
   </w:abstractNum>
-  <w:abstractNum w:abstractNumId="30" w15:restartNumberingAfterBreak="0">
+  <w:abstractNum w:abstractNumId="33" w15:restartNumberingAfterBreak="0">
     <w:nsid w:val="580341C7"/>
     <w:multiLevelType w:val="multilevel"/>
     <w:tmpl w:val="B7782796"/>
@@ -14268,7 +15763,7 @@
       </w:pPr>
     </w:lvl>
   </w:abstractNum>
-  <w:abstractNum w:abstractNumId="31" w15:restartNumberingAfterBreak="0">
+  <w:abstractNum w:abstractNumId="34" w15:restartNumberingAfterBreak="0">
     <w:nsid w:val="59A85DD6"/>
     <w:multiLevelType w:val="multilevel"/>
     <w:tmpl w:val="458EEFB2"/>
@@ -14399,7 +15894,7 @@
       </w:rPr>
     </w:lvl>
   </w:abstractNum>
-  <w:abstractNum w:abstractNumId="32" w15:restartNumberingAfterBreak="0">
+  <w:abstractNum w:abstractNumId="35" w15:restartNumberingAfterBreak="0">
     <w:nsid w:val="5BEC2F8C"/>
     <w:multiLevelType w:val="multilevel"/>
     <w:tmpl w:val="B7EA37DA"/>
@@ -14548,7 +16043,7 @@
       </w:rPr>
     </w:lvl>
   </w:abstractNum>
-  <w:abstractNum w:abstractNumId="33" w15:restartNumberingAfterBreak="0">
+  <w:abstractNum w:abstractNumId="36" w15:restartNumberingAfterBreak="0">
     <w:nsid w:val="5CA55E49"/>
     <w:multiLevelType w:val="multilevel"/>
     <w:tmpl w:val="B7782796"/>
@@ -14634,7 +16129,7 @@
       </w:pPr>
     </w:lvl>
   </w:abstractNum>
-  <w:abstractNum w:abstractNumId="34" w15:restartNumberingAfterBreak="0">
+  <w:abstractNum w:abstractNumId="37" w15:restartNumberingAfterBreak="0">
     <w:nsid w:val="5D293346"/>
     <w:multiLevelType w:val="multilevel"/>
     <w:tmpl w:val="9BD24190"/>
@@ -14765,7 +16260,7 @@
       </w:rPr>
     </w:lvl>
   </w:abstractNum>
-  <w:abstractNum w:abstractNumId="35" w15:restartNumberingAfterBreak="0">
+  <w:abstractNum w:abstractNumId="38" w15:restartNumberingAfterBreak="0">
     <w:nsid w:val="5DC76E1A"/>
     <w:multiLevelType w:val="multilevel"/>
     <w:tmpl w:val="B7782796"/>
@@ -14851,7 +16346,7 @@
       </w:pPr>
     </w:lvl>
   </w:abstractNum>
-  <w:abstractNum w:abstractNumId="36" w15:restartNumberingAfterBreak="0">
+  <w:abstractNum w:abstractNumId="39" w15:restartNumberingAfterBreak="0">
     <w:nsid w:val="60876B81"/>
     <w:multiLevelType w:val="hybridMultilevel"/>
     <w:tmpl w:val="ED2EBD6A"/>
@@ -14964,7 +16459,7 @@
       </w:rPr>
     </w:lvl>
   </w:abstractNum>
-  <w:abstractNum w:abstractNumId="37" w15:restartNumberingAfterBreak="0">
+  <w:abstractNum w:abstractNumId="40" w15:restartNumberingAfterBreak="0">
     <w:nsid w:val="6AAA57FB"/>
     <w:multiLevelType w:val="multilevel"/>
     <w:tmpl w:val="2424FE2E"/>
@@ -15095,7 +16590,7 @@
       </w:rPr>
     </w:lvl>
   </w:abstractNum>
-  <w:abstractNum w:abstractNumId="38" w15:restartNumberingAfterBreak="0">
+  <w:abstractNum w:abstractNumId="41" w15:restartNumberingAfterBreak="0">
     <w:nsid w:val="6C0D024F"/>
     <w:multiLevelType w:val="multilevel"/>
     <w:tmpl w:val="6D969912"/>
@@ -15226,7 +16721,7 @@
       </w:rPr>
     </w:lvl>
   </w:abstractNum>
-  <w:abstractNum w:abstractNumId="39" w15:restartNumberingAfterBreak="0">
+  <w:abstractNum w:abstractNumId="42" w15:restartNumberingAfterBreak="0">
     <w:nsid w:val="6E26667C"/>
     <w:multiLevelType w:val="multilevel"/>
     <w:tmpl w:val="B7782796"/>
@@ -15312,7 +16807,7 @@
       </w:pPr>
     </w:lvl>
   </w:abstractNum>
-  <w:abstractNum w:abstractNumId="40" w15:restartNumberingAfterBreak="0">
+  <w:abstractNum w:abstractNumId="43" w15:restartNumberingAfterBreak="0">
     <w:nsid w:val="74762D2E"/>
     <w:multiLevelType w:val="multilevel"/>
     <w:tmpl w:val="121C0AE6"/>
@@ -15461,7 +16956,7 @@
       </w:rPr>
     </w:lvl>
   </w:abstractNum>
-  <w:abstractNum w:abstractNumId="41" w15:restartNumberingAfterBreak="0">
+  <w:abstractNum w:abstractNumId="44" w15:restartNumberingAfterBreak="0">
     <w:nsid w:val="777F20BB"/>
     <w:multiLevelType w:val="multilevel"/>
     <w:tmpl w:val="BDB0AD76"/>
@@ -15592,7 +17087,7 @@
       </w:rPr>
     </w:lvl>
   </w:abstractNum>
-  <w:abstractNum w:abstractNumId="42" w15:restartNumberingAfterBreak="0">
+  <w:abstractNum w:abstractNumId="45" w15:restartNumberingAfterBreak="0">
     <w:nsid w:val="7E056A4E"/>
     <w:multiLevelType w:val="hybridMultilevel"/>
     <w:tmpl w:val="DC80A0FC"/>
@@ -15706,106 +17201,106 @@
     </w:lvl>
   </w:abstractNum>
   <w:num w:numId="1" w16cid:durableId="2037997188">
-    <w:abstractNumId w:val="14"/>
+    <w:abstractNumId w:val="16"/>
   </w:num>
   <w:num w:numId="2" w16cid:durableId="472916233">
-    <w:abstractNumId w:val="10"/>
+    <w:abstractNumId w:val="11"/>
   </w:num>
   <w:num w:numId="3" w16cid:durableId="700280565">
-    <w:abstractNumId w:val="23"/>
+    <w:abstractNumId w:val="26"/>
   </w:num>
   <w:num w:numId="4" w16cid:durableId="1625888928">
-    <w:abstractNumId w:val="26"/>
+    <w:abstractNumId w:val="29"/>
   </w:num>
   <w:num w:numId="5" w16cid:durableId="1546720220">
-    <w:abstractNumId w:val="38"/>
+    <w:abstractNumId w:val="41"/>
   </w:num>
   <w:num w:numId="6" w16cid:durableId="1209025104">
-    <w:abstractNumId w:val="22"/>
+    <w:abstractNumId w:val="25"/>
   </w:num>
   <w:num w:numId="7" w16cid:durableId="1398700883">
-    <w:abstractNumId w:val="27"/>
+    <w:abstractNumId w:val="30"/>
   </w:num>
   <w:num w:numId="8" w16cid:durableId="2030252318">
     <w:abstractNumId w:val="9"/>
   </w:num>
   <w:num w:numId="9" w16cid:durableId="1033656427">
-    <w:abstractNumId w:val="34"/>
+    <w:abstractNumId w:val="37"/>
   </w:num>
   <w:num w:numId="10" w16cid:durableId="330526038">
     <w:abstractNumId w:val="8"/>
   </w:num>
   <w:num w:numId="11" w16cid:durableId="902569787">
-    <w:abstractNumId w:val="37"/>
+    <w:abstractNumId w:val="40"/>
   </w:num>
   <w:num w:numId="12" w16cid:durableId="1285960002">
-    <w:abstractNumId w:val="25"/>
+    <w:abstractNumId w:val="28"/>
   </w:num>
   <w:num w:numId="13" w16cid:durableId="1042098390">
-    <w:abstractNumId w:val="21"/>
+    <w:abstractNumId w:val="24"/>
   </w:num>
   <w:num w:numId="14" w16cid:durableId="541134893">
-    <w:abstractNumId w:val="31"/>
+    <w:abstractNumId w:val="34"/>
   </w:num>
   <w:num w:numId="15" w16cid:durableId="488403565">
-    <w:abstractNumId w:val="13"/>
+    <w:abstractNumId w:val="14"/>
   </w:num>
   <w:num w:numId="16" w16cid:durableId="660348908">
-    <w:abstractNumId w:val="15"/>
+    <w:abstractNumId w:val="17"/>
   </w:num>
   <w:num w:numId="17" w16cid:durableId="1119228934">
-    <w:abstractNumId w:val="41"/>
+    <w:abstractNumId w:val="44"/>
   </w:num>
   <w:num w:numId="18" w16cid:durableId="1492912978">
+    <w:abstractNumId w:val="36"/>
+  </w:num>
+  <w:num w:numId="19" w16cid:durableId="469371072">
     <w:abstractNumId w:val="33"/>
   </w:num>
-  <w:num w:numId="19" w16cid:durableId="469371072">
-    <w:abstractNumId w:val="30"/>
-  </w:num>
   <w:num w:numId="20" w16cid:durableId="1586457831">
-    <w:abstractNumId w:val="11"/>
+    <w:abstractNumId w:val="12"/>
   </w:num>
   <w:num w:numId="21" w16cid:durableId="1978952453">
-    <w:abstractNumId w:val="36"/>
+    <w:abstractNumId w:val="39"/>
   </w:num>
   <w:num w:numId="22" w16cid:durableId="398596237">
     <w:abstractNumId w:val="7"/>
   </w:num>
   <w:num w:numId="23" w16cid:durableId="162935224">
-    <w:abstractNumId w:val="29"/>
+    <w:abstractNumId w:val="32"/>
   </w:num>
   <w:num w:numId="24" w16cid:durableId="695544265">
     <w:abstractNumId w:val="4"/>
   </w:num>
   <w:num w:numId="25" w16cid:durableId="1141771324">
-    <w:abstractNumId w:val="19"/>
+    <w:abstractNumId w:val="22"/>
   </w:num>
   <w:num w:numId="26" w16cid:durableId="228423116">
     <w:abstractNumId w:val="6"/>
   </w:num>
   <w:num w:numId="27" w16cid:durableId="743260107">
-    <w:abstractNumId w:val="12"/>
+    <w:abstractNumId w:val="13"/>
   </w:num>
   <w:num w:numId="28" w16cid:durableId="1584531532">
-    <w:abstractNumId w:val="42"/>
+    <w:abstractNumId w:val="45"/>
   </w:num>
   <w:num w:numId="29" w16cid:durableId="139734288">
     <w:abstractNumId w:val="2"/>
   </w:num>
   <w:num w:numId="30" w16cid:durableId="1609040212">
-    <w:abstractNumId w:val="16"/>
+    <w:abstractNumId w:val="18"/>
   </w:num>
   <w:num w:numId="31" w16cid:durableId="1071469803">
-    <w:abstractNumId w:val="28"/>
+    <w:abstractNumId w:val="31"/>
   </w:num>
   <w:num w:numId="32" w16cid:durableId="544872860">
-    <w:abstractNumId w:val="17"/>
+    <w:abstractNumId w:val="19"/>
   </w:num>
   <w:num w:numId="33" w16cid:durableId="65879153">
     <w:abstractNumId w:val="5"/>
   </w:num>
   <w:num w:numId="34" w16cid:durableId="150027676">
-    <w:abstractNumId w:val="24"/>
+    <w:abstractNumId w:val="27"/>
   </w:num>
   <w:num w:numId="35" w16cid:durableId="1529221807">
     <w:abstractNumId w:val="0"/>
@@ -15817,22 +17312,31 @@
     <w:abstractNumId w:val="1"/>
   </w:num>
   <w:num w:numId="38" w16cid:durableId="284429522">
-    <w:abstractNumId w:val="32"/>
+    <w:abstractNumId w:val="35"/>
   </w:num>
   <w:num w:numId="39" w16cid:durableId="241793982">
-    <w:abstractNumId w:val="18"/>
+    <w:abstractNumId w:val="21"/>
   </w:num>
   <w:num w:numId="40" w16cid:durableId="1543782023">
+    <w:abstractNumId w:val="23"/>
+  </w:num>
+  <w:num w:numId="41" w16cid:durableId="718869093">
+    <w:abstractNumId w:val="43"/>
+  </w:num>
+  <w:num w:numId="42" w16cid:durableId="923028332">
+    <w:abstractNumId w:val="38"/>
+  </w:num>
+  <w:num w:numId="43" w16cid:durableId="896429803">
+    <w:abstractNumId w:val="42"/>
+  </w:num>
+  <w:num w:numId="44" w16cid:durableId="529299375">
     <w:abstractNumId w:val="20"/>
   </w:num>
-  <w:num w:numId="41" w16cid:durableId="718869093">
-    <w:abstractNumId w:val="40"/>
+  <w:num w:numId="45" w16cid:durableId="945577009">
+    <w:abstractNumId w:val="10"/>
   </w:num>
-  <w:num w:numId="42" w16cid:durableId="923028332">
-    <w:abstractNumId w:val="35"/>
-  </w:num>
-  <w:num w:numId="43" w16cid:durableId="896429803">
-    <w:abstractNumId w:val="39"/>
+  <w:num w:numId="46" w16cid:durableId="1835291390">
+    <w:abstractNumId w:val="15"/>
   </w:num>
 </w:numbering>
 </file>
@@ -16257,6 +17761,7 @@
     <w:name w:val="heading 2"/>
     <w:basedOn w:val="Normal"/>
     <w:next w:val="Normal"/>
+    <w:link w:val="Ttulo2Char"/>
     <w:uiPriority w:val="9"/>
     <w:unhideWhenUsed/>
     <w:qFormat/>
@@ -16359,6 +17864,7 @@
   <w:style w:type="character" w:default="1" w:styleId="Fontepargpadro">
     <w:name w:val="Default Paragraph Font"/>
     <w:uiPriority w:val="1"/>
+    <w:semiHidden/>
     <w:unhideWhenUsed/>
   </w:style>
   <w:style w:type="table" w:default="1" w:styleId="Tabelanormal">
@@ -16578,6 +18084,19 @@
       <w:sz w:val="24"/>
       <w:szCs w:val="24"/>
       <w:lang w:val="pt-BR"/>
+    </w:rPr>
+  </w:style>
+  <w:style w:type="character" w:customStyle="1" w:styleId="Ttulo2Char">
+    <w:name w:val="Título 2 Char"/>
+    <w:basedOn w:val="Fontepargpadro"/>
+    <w:link w:val="Ttulo2"/>
+    <w:uiPriority w:val="9"/>
+    <w:rsid w:val="0021295E"/>
+    <w:rPr>
+      <w:rFonts w:eastAsia="Cambria" w:cs="Cambria"/>
+      <w:color w:val="000000" w:themeColor="text1"/>
+      <w:sz w:val="24"/>
+      <w:szCs w:val="26"/>
     </w:rPr>
   </w:style>
 </w:styles>

</xml_diff>